<commit_message>
04: sin control de tamaño, winsorización y nombres legibles; celda limpia del Kaitz +0,82% (p=0,02); corrige la lectura de monotonicidad
Co-Authored-By: Claude Sonnet 5 <noreply@anthropic.com>
</commit_message>
<xml_diff>
--- a/4. RESULTADOS/04_decision_medida/00_compendio_tablas.docx
+++ b/4. RESULTADOS/04_decision_medida/00_compendio_tablas.docx
@@ -35,7 +35,7 @@
         <w:tblLook w:firstRow="1" w:lastRow="0" w:firstColumn="0" w:lastColumn="0" w:noHBand="0" w:noVBand="1"/>
       </w:tblPr>
       <w:tblGrid>
-        <w:gridCol w:w="1585"/>
+        <w:gridCol w:w="2587"/>
         <w:gridCol w:w="1426"/>
         <w:gridCol w:w="2025"/>
         <w:gridCol w:w="2147"/>
@@ -489,7 +489,7 @@
                 <w:szCs w:val="22"/>
                 <w:color w:val="000000"/>
               </w:rPr>
-              <w:t xml:space="preserve">Bite</w:t>
+              <w:t xml:space="preserve">Kaitz de obreros</w:t>
             </w:r>
           </w:p>
         </w:tc>
@@ -544,7 +544,7 @@
                 <w:szCs w:val="22"/>
                 <w:color w:val="000000"/>
               </w:rPr>
-              <w:t xml:space="preserve">1.145</w:t>
+              <w:t xml:space="preserve">0.825</w:t>
             </w:r>
           </w:p>
         </w:tc>
@@ -599,7 +599,7 @@
                 <w:szCs w:val="22"/>
                 <w:color w:val="000000"/>
               </w:rPr>
-              <w:t xml:space="preserve">0.294</w:t>
+              <w:t xml:space="preserve">0.115</w:t>
             </w:r>
           </w:p>
         </w:tc>
@@ -654,7 +654,7 @@
                 <w:szCs w:val="22"/>
                 <w:color w:val="000000"/>
               </w:rPr>
-              <w:t xml:space="preserve">1.997</w:t>
+              <w:t xml:space="preserve">1.535</w:t>
             </w:r>
           </w:p>
         </w:tc>
@@ -709,7 +709,7 @@
                 <w:szCs w:val="22"/>
                 <w:color w:val="000000"/>
               </w:rPr>
-              <w:t xml:space="preserve">0.008</w:t>
+              <w:t xml:space="preserve">0.023</w:t>
             </w:r>
           </w:p>
         </w:tc>
@@ -764,7 +764,7 @@
                 <w:szCs w:val="22"/>
                 <w:color w:val="000000"/>
               </w:rPr>
-              <w:t xml:space="preserve">***</w:t>
+              <w:t xml:space="preserve">**</w:t>
             </w:r>
           </w:p>
         </w:tc>
@@ -819,7 +819,7 @@
                 <w:szCs w:val="22"/>
                 <w:color w:val="000000"/>
               </w:rPr>
-              <w:t xml:space="preserve">3,880</w:t>
+              <w:t xml:space="preserve">4,930</w:t>
             </w:r>
           </w:p>
         </w:tc>
@@ -879,7 +879,7 @@
                 <w:szCs w:val="22"/>
                 <w:color w:val="000000"/>
               </w:rPr>
-              <w:t xml:space="preserve">Golpe costo</w:t>
+              <w:t xml:space="preserve">Golpe A</w:t>
             </w:r>
           </w:p>
         </w:tc>
@@ -934,7 +934,7 @@
                 <w:szCs w:val="22"/>
                 <w:color w:val="000000"/>
               </w:rPr>
-              <w:t xml:space="preserve">1.017</w:t>
+              <w:t xml:space="preserve">0.495</w:t>
             </w:r>
           </w:p>
         </w:tc>
@@ -989,7 +989,7 @@
                 <w:szCs w:val="22"/>
                 <w:color w:val="000000"/>
               </w:rPr>
-              <w:t xml:space="preserve">0.100</w:t>
+              <w:t xml:space="preserve">-0.210</w:t>
             </w:r>
           </w:p>
         </w:tc>
@@ -1044,7 +1044,7 @@
                 <w:szCs w:val="22"/>
                 <w:color w:val="000000"/>
               </w:rPr>
-              <w:t xml:space="preserve">1.935</w:t>
+              <w:t xml:space="preserve">1.199</w:t>
             </w:r>
           </w:p>
         </w:tc>
@@ -1099,7 +1099,7 @@
                 <w:szCs w:val="22"/>
                 <w:color w:val="000000"/>
               </w:rPr>
-              <w:t xml:space="preserve">0.030</w:t>
+              <w:t xml:space="preserve">0.169</w:t>
             </w:r>
           </w:p>
         </w:tc>
@@ -1154,7 +1154,7 @@
                 <w:szCs w:val="22"/>
                 <w:color w:val="000000"/>
               </w:rPr>
-              <w:t xml:space="preserve">**</w:t>
+              <w:t xml:space="preserve"/>
             </w:r>
           </w:p>
         </w:tc>
@@ -1209,7 +1209,7 @@
                 <w:szCs w:val="22"/>
                 <w:color w:val="000000"/>
               </w:rPr>
-              <w:t xml:space="preserve">5,486</w:t>
+              <w:t xml:space="preserve">5,468</w:t>
             </w:r>
           </w:p>
         </w:tc>
@@ -1269,7 +1269,7 @@
                 <w:szCs w:val="22"/>
                 <w:color w:val="000000"/>
               </w:rPr>
-              <w:t xml:space="preserve">Golpe A</w:t>
+              <w:t xml:space="preserve">Golpe costo</w:t>
             </w:r>
           </w:p>
         </w:tc>
@@ -1324,7 +1324,7 @@
                 <w:szCs w:val="22"/>
                 <w:color w:val="000000"/>
               </w:rPr>
-              <w:t xml:space="preserve">0.872</w:t>
+              <w:t xml:space="preserve">0.471</w:t>
             </w:r>
           </w:p>
         </w:tc>
@@ -1379,7 +1379,7 @@
                 <w:szCs w:val="22"/>
                 <w:color w:val="000000"/>
               </w:rPr>
-              <w:t xml:space="preserve">0.089</w:t>
+              <w:t xml:space="preserve">-0.325</w:t>
             </w:r>
           </w:p>
         </w:tc>
@@ -1434,7 +1434,7 @@
                 <w:szCs w:val="22"/>
                 <w:color w:val="000000"/>
               </w:rPr>
-              <w:t xml:space="preserve">1.655</w:t>
+              <w:t xml:space="preserve">1.267</w:t>
             </w:r>
           </w:p>
         </w:tc>
@@ -1489,7 +1489,7 @@
                 <w:szCs w:val="22"/>
                 <w:color w:val="000000"/>
               </w:rPr>
-              <w:t xml:space="preserve">0.029</w:t>
+              <w:t xml:space="preserve">0.247</w:t>
             </w:r>
           </w:p>
         </w:tc>
@@ -1544,7 +1544,7 @@
                 <w:szCs w:val="22"/>
                 <w:color w:val="000000"/>
               </w:rPr>
-              <w:t xml:space="preserve">**</w:t>
+              <w:t xml:space="preserve"/>
             </w:r>
           </w:p>
         </w:tc>
@@ -1599,7 +1599,7 @@
                 <w:szCs w:val="22"/>
                 <w:color w:val="000000"/>
               </w:rPr>
-              <w:t xml:space="preserve">5,417</w:t>
+              <w:t xml:space="preserve">5,916</w:t>
             </w:r>
           </w:p>
         </w:tc>
@@ -1659,7 +1659,7 @@
                 <w:szCs w:val="22"/>
                 <w:color w:val="000000"/>
               </w:rPr>
-              <w:t xml:space="preserve">Golpe C</w:t>
+              <w:t xml:space="preserve">Proporción de obreros</w:t>
             </w:r>
           </w:p>
         </w:tc>
@@ -1714,7 +1714,7 @@
                 <w:szCs w:val="22"/>
                 <w:color w:val="000000"/>
               </w:rPr>
-              <w:t xml:space="preserve">0.758</w:t>
+              <w:t xml:space="preserve">0.425</w:t>
             </w:r>
           </w:p>
         </w:tc>
@@ -1769,7 +1769,7 @@
                 <w:szCs w:val="22"/>
                 <w:color w:val="000000"/>
               </w:rPr>
-              <w:t xml:space="preserve">-0.134</w:t>
+              <w:t xml:space="preserve">-0.475</w:t>
             </w:r>
           </w:p>
         </w:tc>
@@ -1824,7 +1824,7 @@
                 <w:szCs w:val="22"/>
                 <w:color w:val="000000"/>
               </w:rPr>
-              <w:t xml:space="preserve">1.650</w:t>
+              <w:t xml:space="preserve">1.326</w:t>
             </w:r>
           </w:p>
         </w:tc>
@@ -1879,7 +1879,7 @@
                 <w:szCs w:val="22"/>
                 <w:color w:val="000000"/>
               </w:rPr>
-              <w:t xml:space="preserve">0.096</w:t>
+              <w:t xml:space="preserve">0.355</w:t>
             </w:r>
           </w:p>
         </w:tc>
@@ -1934,7 +1934,7 @@
                 <w:szCs w:val="22"/>
                 <w:color w:val="000000"/>
               </w:rPr>
-              <w:t xml:space="preserve">*</w:t>
+              <w:t xml:space="preserve"/>
             </w:r>
           </w:p>
         </w:tc>
@@ -1989,7 +1989,7 @@
                 <w:szCs w:val="22"/>
                 <w:color w:val="000000"/>
               </w:rPr>
-              <w:t xml:space="preserve">5,439</w:t>
+              <w:t xml:space="preserve">5,912</w:t>
             </w:r>
           </w:p>
         </w:tc>
@@ -2049,7 +2049,7 @@
                 <w:szCs w:val="22"/>
                 <w:color w:val="000000"/>
               </w:rPr>
-              <w:t xml:space="preserve">Exposure</w:t>
+              <w:t xml:space="preserve">Golpe C</w:t>
             </w:r>
           </w:p>
         </w:tc>
@@ -2104,7 +2104,7 @@
                 <w:szCs w:val="22"/>
                 <w:color w:val="000000"/>
               </w:rPr>
-              <w:t xml:space="preserve">0.457</w:t>
+              <w:t xml:space="preserve">0.382</w:t>
             </w:r>
           </w:p>
         </w:tc>
@@ -2159,7 +2159,7 @@
                 <w:szCs w:val="22"/>
                 <w:color w:val="000000"/>
               </w:rPr>
-              <w:t xml:space="preserve">-0.451</w:t>
+              <w:t xml:space="preserve">-0.393</w:t>
             </w:r>
           </w:p>
         </w:tc>
@@ -2214,7 +2214,7 @@
                 <w:szCs w:val="22"/>
                 <w:color w:val="000000"/>
               </w:rPr>
-              <w:t xml:space="preserve">1.366</w:t>
+              <w:t xml:space="preserve">1.158</w:t>
             </w:r>
           </w:p>
         </w:tc>
@@ -2269,7 +2269,7 @@
                 <w:szCs w:val="22"/>
                 <w:color w:val="000000"/>
               </w:rPr>
-              <w:t xml:space="preserve">0.324</w:t>
+              <w:t xml:space="preserve">0.334</w:t>
             </w:r>
           </w:p>
         </w:tc>
@@ -2379,7 +2379,7 @@
                 <w:szCs w:val="22"/>
                 <w:color w:val="000000"/>
               </w:rPr>
-              <w:t xml:space="preserve">5,912</w:t>
+              <w:t xml:space="preserve">5,468</w:t>
             </w:r>
           </w:p>
         </w:tc>
@@ -2418,13 +2418,13 @@
         <w:tblLook w:firstRow="1" w:lastRow="0" w:firstColumn="0" w:lastColumn="0" w:noHBand="0" w:noVBand="1"/>
       </w:tblPr>
       <w:tblGrid>
-        <w:gridCol w:w="1585"/>
+        <w:gridCol w:w="2587"/>
         <w:gridCol w:w="3786"/>
         <w:gridCol w:w="1426"/>
         <w:gridCol w:w="1132"/>
         <w:gridCol w:w="1609"/>
         <w:gridCol w:w="1829"/>
-        <w:gridCol w:w="7076"/>
+        <w:gridCol w:w="8592"/>
       </w:tblGrid>
       <w:tr>
         <w:trPr>
@@ -2872,7 +2872,7 @@
                 <w:szCs w:val="22"/>
                 <w:color w:val="000000"/>
               </w:rPr>
-              <w:t xml:space="preserve">Bite</w:t>
+              <w:t xml:space="preserve">Golpe A</w:t>
             </w:r>
           </w:p>
         </w:tc>
@@ -2982,7 +2982,7 @@
                 <w:szCs w:val="22"/>
                 <w:color w:val="000000"/>
               </w:rPr>
-              <w:t xml:space="preserve">6.581</w:t>
+              <w:t xml:space="preserve">7.631</w:t>
             </w:r>
           </w:p>
         </w:tc>
@@ -3147,7 +3147,7 @@
                 <w:szCs w:val="22"/>
                 <w:color w:val="000000"/>
               </w:rPr>
-              <w:t xml:space="preserve">3,881</w:t>
+              <w:t xml:space="preserve">5,470</w:t>
             </w:r>
           </w:p>
         </w:tc>
@@ -3262,7 +3262,7 @@
                 <w:szCs w:val="22"/>
                 <w:color w:val="000000"/>
               </w:rPr>
-              <w:t xml:space="preserve">Bite</w:t>
+              <w:t xml:space="preserve">Golpe A</w:t>
             </w:r>
           </w:p>
         </w:tc>
@@ -3372,7 +3372,7 @@
                 <w:szCs w:val="22"/>
                 <w:color w:val="000000"/>
               </w:rPr>
-              <w:t xml:space="preserve">2.719</w:t>
+              <w:t xml:space="preserve">2.408</w:t>
             </w:r>
           </w:p>
         </w:tc>
@@ -3537,7 +3537,7 @@
                 <w:szCs w:val="22"/>
                 <w:color w:val="000000"/>
               </w:rPr>
-              <w:t xml:space="preserve">3,876</w:t>
+              <w:t xml:space="preserve">5,461</w:t>
             </w:r>
           </w:p>
         </w:tc>
@@ -3592,7 +3592,7 @@
                 <w:szCs w:val="22"/>
                 <w:color w:val="000000"/>
               </w:rPr>
-              <w:t xml:space="preserve">Limpia pero el outcome mezcla dos aumentos del mínimo</w:t>
+              <w:t xml:space="preserve">Sin traslape, pero mezcla dos aumentos del mínimo y parte de 2021 (pospandemia)</w:t>
             </w:r>
           </w:p>
         </w:tc>
@@ -3652,7 +3652,7 @@
                 <w:szCs w:val="22"/>
                 <w:color w:val="000000"/>
               </w:rPr>
-              <w:t xml:space="preserve">Bite</w:t>
+              <w:t xml:space="preserve">Golpe A</w:t>
             </w:r>
           </w:p>
         </w:tc>
@@ -3762,7 +3762,7 @@
                 <w:szCs w:val="22"/>
                 <w:color w:val="000000"/>
               </w:rPr>
-              <w:t xml:space="preserve">1.145</w:t>
+              <w:t xml:space="preserve">0.495</w:t>
             </w:r>
           </w:p>
         </w:tc>
@@ -3817,7 +3817,7 @@
                 <w:szCs w:val="22"/>
                 <w:color w:val="000000"/>
               </w:rPr>
-              <w:t xml:space="preserve">0.008</w:t>
+              <w:t xml:space="preserve">0.169</w:t>
             </w:r>
           </w:p>
         </w:tc>
@@ -3872,7 +3872,7 @@
                 <w:szCs w:val="22"/>
                 <w:color w:val="000000"/>
               </w:rPr>
-              <w:t xml:space="preserve">***</w:t>
+              <w:t xml:space="preserve"/>
             </w:r>
           </w:p>
         </w:tc>
@@ -3927,7 +3927,7 @@
                 <w:szCs w:val="22"/>
                 <w:color w:val="000000"/>
               </w:rPr>
-              <w:t xml:space="preserve">3,880</w:t>
+              <w:t xml:space="preserve">5,468</w:t>
             </w:r>
           </w:p>
         </w:tc>
@@ -4042,7 +4042,7 @@
                 <w:szCs w:val="22"/>
                 <w:color w:val="000000"/>
               </w:rPr>
-              <w:t xml:space="preserve">Bite</w:t>
+              <w:t xml:space="preserve">Golpe A</w:t>
             </w:r>
           </w:p>
         </w:tc>
@@ -4152,7 +4152,7 @@
                 <w:szCs w:val="22"/>
                 <w:color w:val="000000"/>
               </w:rPr>
-              <w:t xml:space="preserve">-1.749</w:t>
+              <w:t xml:space="preserve">-1.881</w:t>
             </w:r>
           </w:p>
         </w:tc>
@@ -4207,7 +4207,7 @@
                 <w:szCs w:val="22"/>
                 <w:color w:val="000000"/>
               </w:rPr>
-              <w:t xml:space="preserve">0.004</w:t>
+              <w:t xml:space="preserve">0.000</w:t>
             </w:r>
           </w:p>
         </w:tc>
@@ -4317,7 +4317,7 @@
                 <w:szCs w:val="22"/>
                 <w:color w:val="000000"/>
               </w:rPr>
-              <w:t xml:space="preserve">4,782</w:t>
+              <w:t xml:space="preserve">5,503</w:t>
             </w:r>
           </w:p>
         </w:tc>
@@ -4432,7 +4432,7 @@
                 <w:szCs w:val="22"/>
                 <w:color w:val="000000"/>
               </w:rPr>
-              <w:t xml:space="preserve">Bite</w:t>
+              <w:t xml:space="preserve">Golpe A</w:t>
             </w:r>
           </w:p>
         </w:tc>
@@ -4542,7 +4542,7 @@
                 <w:szCs w:val="22"/>
                 <w:color w:val="000000"/>
               </w:rPr>
-              <w:t xml:space="preserve">0.462</w:t>
+              <w:t xml:space="preserve">-0.093</w:t>
             </w:r>
           </w:p>
         </w:tc>
@@ -4597,7 +4597,7 @@
                 <w:szCs w:val="22"/>
                 <w:color w:val="000000"/>
               </w:rPr>
-              <w:t xml:space="preserve">0.460</w:t>
+              <w:t xml:space="preserve">0.876</w:t>
             </w:r>
           </w:p>
         </w:tc>
@@ -4707,7 +4707,7 @@
                 <w:szCs w:val="22"/>
                 <w:color w:val="000000"/>
               </w:rPr>
-              <w:t xml:space="preserve">4,828</w:t>
+              <w:t xml:space="preserve">5,558</w:t>
             </w:r>
           </w:p>
         </w:tc>
@@ -4822,7 +4822,7 @@
                 <w:szCs w:val="22"/>
                 <w:color w:val="000000"/>
               </w:rPr>
-              <w:t xml:space="preserve">Bite</w:t>
+              <w:t xml:space="preserve">Golpe A</w:t>
             </w:r>
           </w:p>
         </w:tc>
@@ -4932,7 +4932,7 @@
                 <w:szCs w:val="22"/>
                 <w:color w:val="000000"/>
               </w:rPr>
-              <w:t xml:space="preserve">2.983</w:t>
+              <w:t xml:space="preserve">3.190</w:t>
             </w:r>
           </w:p>
         </w:tc>
@@ -5097,7 +5097,7 @@
                 <w:szCs w:val="22"/>
                 <w:color w:val="000000"/>
               </w:rPr>
-              <w:t xml:space="preserve">4,863</w:t>
+              <w:t xml:space="preserve">5,599</w:t>
             </w:r>
           </w:p>
         </w:tc>
@@ -5212,7 +5212,7 @@
                 <w:szCs w:val="22"/>
                 <w:color w:val="000000"/>
               </w:rPr>
-              <w:t xml:space="preserve">Exposure</w:t>
+              <w:t xml:space="preserve">Golpe C</w:t>
             </w:r>
           </w:p>
         </w:tc>
@@ -5322,7 +5322,7 @@
                 <w:szCs w:val="22"/>
                 <w:color w:val="000000"/>
               </w:rPr>
-              <w:t xml:space="preserve">2.065</w:t>
+              <w:t xml:space="preserve">7.406</w:t>
             </w:r>
           </w:p>
         </w:tc>
@@ -5487,7 +5487,7 @@
                 <w:szCs w:val="22"/>
                 <w:color w:val="000000"/>
               </w:rPr>
-              <w:t xml:space="preserve">5,916</w:t>
+              <w:t xml:space="preserve">5,470</w:t>
             </w:r>
           </w:p>
         </w:tc>
@@ -5602,7 +5602,7 @@
                 <w:szCs w:val="22"/>
                 <w:color w:val="000000"/>
               </w:rPr>
-              <w:t xml:space="preserve">Exposure</w:t>
+              <w:t xml:space="preserve">Golpe C</w:t>
             </w:r>
           </w:p>
         </w:tc>
@@ -5712,7 +5712,7 @@
                 <w:szCs w:val="22"/>
                 <w:color w:val="000000"/>
               </w:rPr>
-              <w:t xml:space="preserve">1.412</w:t>
+              <w:t xml:space="preserve">2.210</w:t>
             </w:r>
           </w:p>
         </w:tc>
@@ -5767,7 +5767,7 @@
                 <w:szCs w:val="22"/>
                 <w:color w:val="000000"/>
               </w:rPr>
-              <w:t xml:space="preserve">0.020</w:t>
+              <w:t xml:space="preserve">0.000</w:t>
             </w:r>
           </w:p>
         </w:tc>
@@ -5822,7 +5822,7 @@
                 <w:szCs w:val="22"/>
                 <w:color w:val="000000"/>
               </w:rPr>
-              <w:t xml:space="preserve">**</w:t>
+              <w:t xml:space="preserve">***</w:t>
             </w:r>
           </w:p>
         </w:tc>
@@ -5877,7 +5877,7 @@
                 <w:szCs w:val="22"/>
                 <w:color w:val="000000"/>
               </w:rPr>
-              <w:t xml:space="preserve">5,900</w:t>
+              <w:t xml:space="preserve">5,461</w:t>
             </w:r>
           </w:p>
         </w:tc>
@@ -5932,7 +5932,7 @@
                 <w:szCs w:val="22"/>
                 <w:color w:val="000000"/>
               </w:rPr>
-              <w:t xml:space="preserve">Limpia pero el outcome mezcla dos aumentos del mínimo</w:t>
+              <w:t xml:space="preserve">Sin traslape, pero mezcla dos aumentos del mínimo y parte de 2021 (pospandemia)</w:t>
             </w:r>
           </w:p>
         </w:tc>
@@ -5992,7 +5992,7 @@
                 <w:szCs w:val="22"/>
                 <w:color w:val="000000"/>
               </w:rPr>
-              <w:t xml:space="preserve">Exposure</w:t>
+              <w:t xml:space="preserve">Golpe C</w:t>
             </w:r>
           </w:p>
         </w:tc>
@@ -6102,7 +6102,7 @@
                 <w:szCs w:val="22"/>
                 <w:color w:val="000000"/>
               </w:rPr>
-              <w:t xml:space="preserve">0.457</w:t>
+              <w:t xml:space="preserve">0.382</w:t>
             </w:r>
           </w:p>
         </w:tc>
@@ -6157,7 +6157,7 @@
                 <w:szCs w:val="22"/>
                 <w:color w:val="000000"/>
               </w:rPr>
-              <w:t xml:space="preserve">0.324</w:t>
+              <w:t xml:space="preserve">0.334</w:t>
             </w:r>
           </w:p>
         </w:tc>
@@ -6267,7 +6267,7 @@
                 <w:szCs w:val="22"/>
                 <w:color w:val="000000"/>
               </w:rPr>
-              <w:t xml:space="preserve">5,912</w:t>
+              <w:t xml:space="preserve">5,468</w:t>
             </w:r>
           </w:p>
         </w:tc>
@@ -6382,7 +6382,7 @@
                 <w:szCs w:val="22"/>
                 <w:color w:val="000000"/>
               </w:rPr>
-              <w:t xml:space="preserve">Exposure</w:t>
+              <w:t xml:space="preserve">Golpe C</w:t>
             </w:r>
           </w:p>
         </w:tc>
@@ -6492,7 +6492,7 @@
                 <w:szCs w:val="22"/>
                 <w:color w:val="000000"/>
               </w:rPr>
-              <w:t xml:space="preserve">-0.095</w:t>
+              <w:t xml:space="preserve">-2.588</w:t>
             </w:r>
           </w:p>
         </w:tc>
@@ -6547,7 +6547,7 @@
                 <w:szCs w:val="22"/>
                 <w:color w:val="000000"/>
               </w:rPr>
-              <w:t xml:space="preserve">0.866</w:t>
+              <w:t xml:space="preserve">0.000</w:t>
             </w:r>
           </w:p>
         </w:tc>
@@ -6602,7 +6602,7 @@
                 <w:szCs w:val="22"/>
                 <w:color w:val="000000"/>
               </w:rPr>
-              <w:t xml:space="preserve"/>
+              <w:t xml:space="preserve">***</w:t>
             </w:r>
           </w:p>
         </w:tc>
@@ -6657,7 +6657,7 @@
                 <w:szCs w:val="22"/>
                 <w:color w:val="000000"/>
               </w:rPr>
-              <w:t xml:space="preserve">5,917</w:t>
+              <w:t xml:space="preserve">5,503</w:t>
             </w:r>
           </w:p>
         </w:tc>
@@ -6772,7 +6772,7 @@
                 <w:szCs w:val="22"/>
                 <w:color w:val="000000"/>
               </w:rPr>
-              <w:t xml:space="preserve">Exposure</w:t>
+              <w:t xml:space="preserve">Golpe C</w:t>
             </w:r>
           </w:p>
         </w:tc>
@@ -6882,7 +6882,7 @@
                 <w:szCs w:val="22"/>
                 <w:color w:val="000000"/>
               </w:rPr>
-              <w:t xml:space="preserve">0.711</w:t>
+              <w:t xml:space="preserve">-0.438</w:t>
             </w:r>
           </w:p>
         </w:tc>
@@ -6937,7 +6937,7 @@
                 <w:szCs w:val="22"/>
                 <w:color w:val="000000"/>
               </w:rPr>
-              <w:t xml:space="preserve">0.280</w:t>
+              <w:t xml:space="preserve">0.471</w:t>
             </w:r>
           </w:p>
         </w:tc>
@@ -7047,7 +7047,7 @@
                 <w:szCs w:val="22"/>
                 <w:color w:val="000000"/>
               </w:rPr>
-              <w:t xml:space="preserve">5,971</w:t>
+              <w:t xml:space="preserve">5,558</w:t>
             </w:r>
           </w:p>
         </w:tc>
@@ -7162,7 +7162,7 @@
                 <w:szCs w:val="22"/>
                 <w:color w:val="000000"/>
               </w:rPr>
-              <w:t xml:space="preserve">Exposure</w:t>
+              <w:t xml:space="preserve">Golpe C</w:t>
             </w:r>
           </w:p>
         </w:tc>
@@ -7272,7 +7272,7 @@
                 <w:szCs w:val="22"/>
                 <w:color w:val="000000"/>
               </w:rPr>
-              <w:t xml:space="preserve">0.193</w:t>
+              <w:t xml:space="preserve">3.094</w:t>
             </w:r>
           </w:p>
         </w:tc>
@@ -7327,7 +7327,7 @@
                 <w:szCs w:val="22"/>
                 <w:color w:val="000000"/>
               </w:rPr>
-              <w:t xml:space="preserve">0.703</w:t>
+              <w:t xml:space="preserve">0.000</w:t>
             </w:r>
           </w:p>
         </w:tc>
@@ -7382,7 +7382,7 @@
                 <w:szCs w:val="22"/>
                 <w:color w:val="000000"/>
               </w:rPr>
-              <w:t xml:space="preserve"/>
+              <w:t xml:space="preserve">***</w:t>
             </w:r>
           </w:p>
         </w:tc>
@@ -7437,7 +7437,7 @@
                 <w:szCs w:val="22"/>
                 <w:color w:val="000000"/>
               </w:rPr>
-              <w:t xml:space="preserve">6,017</w:t>
+              <w:t xml:space="preserve">5,599</w:t>
             </w:r>
           </w:p>
         </w:tc>
@@ -7552,7 +7552,7 @@
                 <w:szCs w:val="22"/>
                 <w:color w:val="000000"/>
               </w:rPr>
-              <w:t xml:space="preserve">Golpe A</w:t>
+              <w:t xml:space="preserve">Golpe costo</w:t>
             </w:r>
           </w:p>
         </w:tc>
@@ -7662,7 +7662,7 @@
                 <w:szCs w:val="22"/>
                 <w:color w:val="000000"/>
               </w:rPr>
-              <w:t xml:space="preserve">7.612</w:t>
+              <w:t xml:space="preserve">13.088</w:t>
             </w:r>
           </w:p>
         </w:tc>
@@ -7827,7 +7827,7 @@
                 <w:szCs w:val="22"/>
                 <w:color w:val="000000"/>
               </w:rPr>
-              <w:t xml:space="preserve">5,419</w:t>
+              <w:t xml:space="preserve">5,920</w:t>
             </w:r>
           </w:p>
         </w:tc>
@@ -7942,7 +7942,7 @@
                 <w:szCs w:val="22"/>
                 <w:color w:val="000000"/>
               </w:rPr>
-              <w:t xml:space="preserve">Golpe A</w:t>
+              <w:t xml:space="preserve">Golpe costo</w:t>
             </w:r>
           </w:p>
         </w:tc>
@@ -8052,7 +8052,7 @@
                 <w:szCs w:val="22"/>
                 <w:color w:val="000000"/>
               </w:rPr>
-              <w:t xml:space="preserve">2.977</w:t>
+              <w:t xml:space="preserve">2.693</w:t>
             </w:r>
           </w:p>
         </w:tc>
@@ -8217,7 +8217,7 @@
                 <w:szCs w:val="22"/>
                 <w:color w:val="000000"/>
               </w:rPr>
-              <w:t xml:space="preserve">5,411</w:t>
+              <w:t xml:space="preserve">5,904</w:t>
             </w:r>
           </w:p>
         </w:tc>
@@ -8272,7 +8272,7 @@
                 <w:szCs w:val="22"/>
                 <w:color w:val="000000"/>
               </w:rPr>
-              <w:t xml:space="preserve">Limpia pero el outcome mezcla dos aumentos del mínimo</w:t>
+              <w:t xml:space="preserve">Sin traslape, pero mezcla dos aumentos del mínimo y parte de 2021 (pospandemia)</w:t>
             </w:r>
           </w:p>
         </w:tc>
@@ -8332,7 +8332,7 @@
                 <w:szCs w:val="22"/>
                 <w:color w:val="000000"/>
               </w:rPr>
-              <w:t xml:space="preserve">Golpe A</w:t>
+              <w:t xml:space="preserve">Golpe costo</w:t>
             </w:r>
           </w:p>
         </w:tc>
@@ -8442,7 +8442,7 @@
                 <w:szCs w:val="22"/>
                 <w:color w:val="000000"/>
               </w:rPr>
-              <w:t xml:space="preserve">0.872</w:t>
+              <w:t xml:space="preserve">0.471</w:t>
             </w:r>
           </w:p>
         </w:tc>
@@ -8497,7 +8497,7 @@
                 <w:szCs w:val="22"/>
                 <w:color w:val="000000"/>
               </w:rPr>
-              <w:t xml:space="preserve">0.029</w:t>
+              <w:t xml:space="preserve">0.247</w:t>
             </w:r>
           </w:p>
         </w:tc>
@@ -8552,7 +8552,7 @@
                 <w:szCs w:val="22"/>
                 <w:color w:val="000000"/>
               </w:rPr>
-              <w:t xml:space="preserve">**</w:t>
+              <w:t xml:space="preserve"/>
             </w:r>
           </w:p>
         </w:tc>
@@ -8607,7 +8607,7 @@
                 <w:szCs w:val="22"/>
                 <w:color w:val="000000"/>
               </w:rPr>
-              <w:t xml:space="preserve">5,417</w:t>
+              <w:t xml:space="preserve">5,916</w:t>
             </w:r>
           </w:p>
         </w:tc>
@@ -8722,7 +8722,7 @@
                 <w:szCs w:val="22"/>
                 <w:color w:val="000000"/>
               </w:rPr>
-              <w:t xml:space="preserve">Golpe A</w:t>
+              <w:t xml:space="preserve">Golpe costo</w:t>
             </w:r>
           </w:p>
         </w:tc>
@@ -8832,7 +8832,7 @@
                 <w:szCs w:val="22"/>
                 <w:color w:val="000000"/>
               </w:rPr>
-              <w:t xml:space="preserve">-2.648</w:t>
+              <w:t xml:space="preserve">-4.098</w:t>
             </w:r>
           </w:p>
         </w:tc>
@@ -8997,7 +8997,7 @@
                 <w:szCs w:val="22"/>
                 <w:color w:val="000000"/>
               </w:rPr>
-              <w:t xml:space="preserve">5,476</w:t>
+              <w:t xml:space="preserve">5,916</w:t>
             </w:r>
           </w:p>
         </w:tc>
@@ -9112,7 +9112,7 @@
                 <w:szCs w:val="22"/>
                 <w:color w:val="000000"/>
               </w:rPr>
-              <w:t xml:space="preserve">Golpe A</w:t>
+              <w:t xml:space="preserve">Golpe costo</w:t>
             </w:r>
           </w:p>
         </w:tc>
@@ -9222,7 +9222,7 @@
                 <w:szCs w:val="22"/>
                 <w:color w:val="000000"/>
               </w:rPr>
-              <w:t xml:space="preserve">-0.122</w:t>
+              <w:t xml:space="preserve">0.345</w:t>
             </w:r>
           </w:p>
         </w:tc>
@@ -9277,7 +9277,7 @@
                 <w:szCs w:val="22"/>
                 <w:color w:val="000000"/>
               </w:rPr>
-              <w:t xml:space="preserve">0.852</w:t>
+              <w:t xml:space="preserve">0.605</w:t>
             </w:r>
           </w:p>
         </w:tc>
@@ -9387,7 +9387,7 @@
                 <w:szCs w:val="22"/>
                 <w:color w:val="000000"/>
               </w:rPr>
-              <w:t xml:space="preserve">5,531</w:t>
+              <w:t xml:space="preserve">5,970</w:t>
             </w:r>
           </w:p>
         </w:tc>
@@ -9502,7 +9502,7 @@
                 <w:szCs w:val="22"/>
                 <w:color w:val="000000"/>
               </w:rPr>
-              <w:t xml:space="preserve">Golpe A</w:t>
+              <w:t xml:space="preserve">Golpe costo</w:t>
             </w:r>
           </w:p>
         </w:tc>
@@ -9612,7 +9612,7 @@
                 <w:szCs w:val="22"/>
                 <w:color w:val="000000"/>
               </w:rPr>
-              <w:t xml:space="preserve">3.459</w:t>
+              <w:t xml:space="preserve">9.040</w:t>
             </w:r>
           </w:p>
         </w:tc>
@@ -9777,7 +9777,7 @@
                 <w:szCs w:val="22"/>
                 <w:color w:val="000000"/>
               </w:rPr>
-              <w:t xml:space="preserve">5,572</w:t>
+              <w:t xml:space="preserve">6,017</w:t>
             </w:r>
           </w:p>
         </w:tc>
@@ -9892,7 +9892,7 @@
                 <w:szCs w:val="22"/>
                 <w:color w:val="000000"/>
               </w:rPr>
-              <w:t xml:space="preserve">Golpe C</w:t>
+              <w:t xml:space="preserve">Kaitz de obreros</w:t>
             </w:r>
           </w:p>
         </w:tc>
@@ -10002,7 +10002,7 @@
                 <w:szCs w:val="22"/>
                 <w:color w:val="000000"/>
               </w:rPr>
-              <w:t xml:space="preserve">7.730</w:t>
+              <w:t xml:space="preserve">7.453</w:t>
             </w:r>
           </w:p>
         </w:tc>
@@ -10167,7 +10167,7 @@
                 <w:szCs w:val="22"/>
                 <w:color w:val="000000"/>
               </w:rPr>
-              <w:t xml:space="preserve">5,441</w:t>
+              <w:t xml:space="preserve">4,932</w:t>
             </w:r>
           </w:p>
         </w:tc>
@@ -10282,7 +10282,7 @@
                 <w:szCs w:val="22"/>
                 <w:color w:val="000000"/>
               </w:rPr>
-              <w:t xml:space="preserve">Golpe C</w:t>
+              <w:t xml:space="preserve">Kaitz de obreros</w:t>
             </w:r>
           </w:p>
         </w:tc>
@@ -10392,7 +10392,7 @@
                 <w:szCs w:val="22"/>
                 <w:color w:val="000000"/>
               </w:rPr>
-              <w:t xml:space="preserve">2.811</w:t>
+              <w:t xml:space="preserve">1.800</w:t>
             </w:r>
           </w:p>
         </w:tc>
@@ -10447,7 +10447,7 @@
                 <w:szCs w:val="22"/>
                 <w:color w:val="000000"/>
               </w:rPr>
-              <w:t xml:space="preserve">0.000</w:t>
+              <w:t xml:space="preserve">0.001</w:t>
             </w:r>
           </w:p>
         </w:tc>
@@ -10557,7 +10557,7 @@
                 <w:szCs w:val="22"/>
                 <w:color w:val="000000"/>
               </w:rPr>
-              <w:t xml:space="preserve">5,432</w:t>
+              <w:t xml:space="preserve">4,925</w:t>
             </w:r>
           </w:p>
         </w:tc>
@@ -10612,7 +10612,7 @@
                 <w:szCs w:val="22"/>
                 <w:color w:val="000000"/>
               </w:rPr>
-              <w:t xml:space="preserve">Limpia pero el outcome mezcla dos aumentos del mínimo</w:t>
+              <w:t xml:space="preserve">Sin traslape, pero mezcla dos aumentos del mínimo y parte de 2021 (pospandemia)</w:t>
             </w:r>
           </w:p>
         </w:tc>
@@ -10672,7 +10672,7 @@
                 <w:szCs w:val="22"/>
                 <w:color w:val="000000"/>
               </w:rPr>
-              <w:t xml:space="preserve">Golpe C</w:t>
+              <w:t xml:space="preserve">Kaitz de obreros</w:t>
             </w:r>
           </w:p>
         </w:tc>
@@ -10782,7 +10782,7 @@
                 <w:szCs w:val="22"/>
                 <w:color w:val="000000"/>
               </w:rPr>
-              <w:t xml:space="preserve">0.758</w:t>
+              <w:t xml:space="preserve">0.825</w:t>
             </w:r>
           </w:p>
         </w:tc>
@@ -10837,7 +10837,7 @@
                 <w:szCs w:val="22"/>
                 <w:color w:val="000000"/>
               </w:rPr>
-              <w:t xml:space="preserve">0.096</w:t>
+              <w:t xml:space="preserve">0.023</w:t>
             </w:r>
           </w:p>
         </w:tc>
@@ -10892,7 +10892,7 @@
                 <w:szCs w:val="22"/>
                 <w:color w:val="000000"/>
               </w:rPr>
-              <w:t xml:space="preserve">*</w:t>
+              <w:t xml:space="preserve">**</w:t>
             </w:r>
           </w:p>
         </w:tc>
@@ -10947,7 +10947,7 @@
                 <w:szCs w:val="22"/>
                 <w:color w:val="000000"/>
               </w:rPr>
-              <w:t xml:space="preserve">5,439</w:t>
+              <w:t xml:space="preserve">4,930</w:t>
             </w:r>
           </w:p>
         </w:tc>
@@ -11062,7 +11062,7 @@
                 <w:szCs w:val="22"/>
                 <w:color w:val="000000"/>
               </w:rPr>
-              <w:t xml:space="preserve">Golpe C</w:t>
+              <w:t xml:space="preserve">Kaitz de obreros</w:t>
             </w:r>
           </w:p>
         </w:tc>
@@ -11172,7 +11172,7 @@
                 <w:szCs w:val="22"/>
                 <w:color w:val="000000"/>
               </w:rPr>
-              <w:t xml:space="preserve">-3.600</w:t>
+              <w:t xml:space="preserve">-1.359</w:t>
             </w:r>
           </w:p>
         </w:tc>
@@ -11227,7 +11227,7 @@
                 <w:szCs w:val="22"/>
                 <w:color w:val="000000"/>
               </w:rPr>
-              <w:t xml:space="preserve">0.000</w:t>
+              <w:t xml:space="preserve">0.009</w:t>
             </w:r>
           </w:p>
         </w:tc>
@@ -11337,7 +11337,7 @@
                 <w:szCs w:val="22"/>
                 <w:color w:val="000000"/>
               </w:rPr>
-              <w:t xml:space="preserve">5,481</w:t>
+              <w:t xml:space="preserve">4,896</w:t>
             </w:r>
           </w:p>
         </w:tc>
@@ -11452,7 +11452,7 @@
                 <w:szCs w:val="22"/>
                 <w:color w:val="000000"/>
               </w:rPr>
-              <w:t xml:space="preserve">Golpe C</w:t>
+              <w:t xml:space="preserve">Kaitz de obreros</w:t>
             </w:r>
           </w:p>
         </w:tc>
@@ -11562,7 +11562,7 @@
                 <w:szCs w:val="22"/>
                 <w:color w:val="000000"/>
               </w:rPr>
-              <w:t xml:space="preserve">-0.439</w:t>
+              <w:t xml:space="preserve">-0.264</w:t>
             </w:r>
           </w:p>
         </w:tc>
@@ -11617,7 +11617,7 @@
                 <w:szCs w:val="22"/>
                 <w:color w:val="000000"/>
               </w:rPr>
-              <w:t xml:space="preserve">0.519</w:t>
+              <w:t xml:space="preserve">0.665</w:t>
             </w:r>
           </w:p>
         </w:tc>
@@ -11727,7 +11727,7 @@
                 <w:szCs w:val="22"/>
                 <w:color w:val="000000"/>
               </w:rPr>
-              <w:t xml:space="preserve">5,536</w:t>
+              <w:t xml:space="preserve">4,942</w:t>
             </w:r>
           </w:p>
         </w:tc>
@@ -11842,7 +11842,7 @@
                 <w:szCs w:val="22"/>
                 <w:color w:val="000000"/>
               </w:rPr>
-              <w:t xml:space="preserve">Golpe C</w:t>
+              <w:t xml:space="preserve">Kaitz de obreros</w:t>
             </w:r>
           </w:p>
         </w:tc>
@@ -11952,7 +11952,7 @@
                 <w:szCs w:val="22"/>
                 <w:color w:val="000000"/>
               </w:rPr>
-              <w:t xml:space="preserve">3.564</w:t>
+              <w:t xml:space="preserve">2.866</w:t>
             </w:r>
           </w:p>
         </w:tc>
@@ -12117,7 +12117,7 @@
                 <w:szCs w:val="22"/>
                 <w:color w:val="000000"/>
               </w:rPr>
-              <w:t xml:space="preserve">5,577</w:t>
+              <w:t xml:space="preserve">4,979</w:t>
             </w:r>
           </w:p>
         </w:tc>
@@ -12232,7 +12232,7 @@
                 <w:szCs w:val="22"/>
                 <w:color w:val="000000"/>
               </w:rPr>
-              <w:t xml:space="preserve">Golpe costo</w:t>
+              <w:t xml:space="preserve">Proporción de obreros</w:t>
             </w:r>
           </w:p>
         </w:tc>
@@ -12342,7 +12342,7 @@
                 <w:szCs w:val="22"/>
                 <w:color w:val="000000"/>
               </w:rPr>
-              <w:t xml:space="preserve">12.944</w:t>
+              <w:t xml:space="preserve">2.096</w:t>
             </w:r>
           </w:p>
         </w:tc>
@@ -12507,7 +12507,7 @@
                 <w:szCs w:val="22"/>
                 <w:color w:val="000000"/>
               </w:rPr>
-              <w:t xml:space="preserve">5,489</w:t>
+              <w:t xml:space="preserve">5,916</w:t>
             </w:r>
           </w:p>
         </w:tc>
@@ -12622,7 +12622,7 @@
                 <w:szCs w:val="22"/>
                 <w:color w:val="000000"/>
               </w:rPr>
-              <w:t xml:space="preserve">Golpe costo</w:t>
+              <w:t xml:space="preserve">Proporción de obreros</w:t>
             </w:r>
           </w:p>
         </w:tc>
@@ -12732,7 +12732,7 @@
                 <w:szCs w:val="22"/>
                 <w:color w:val="000000"/>
               </w:rPr>
-              <w:t xml:space="preserve">3.301</w:t>
+              <w:t xml:space="preserve">1.372</w:t>
             </w:r>
           </w:p>
         </w:tc>
@@ -12787,7 +12787,7 @@
                 <w:szCs w:val="22"/>
                 <w:color w:val="000000"/>
               </w:rPr>
-              <w:t xml:space="preserve">0.000</w:t>
+              <w:t xml:space="preserve">0.024</w:t>
             </w:r>
           </w:p>
         </w:tc>
@@ -12842,7 +12842,7 @@
                 <w:szCs w:val="22"/>
                 <w:color w:val="000000"/>
               </w:rPr>
-              <w:t xml:space="preserve">***</w:t>
+              <w:t xml:space="preserve">**</w:t>
             </w:r>
           </w:p>
         </w:tc>
@@ -12897,7 +12897,7 @@
                 <w:szCs w:val="22"/>
                 <w:color w:val="000000"/>
               </w:rPr>
-              <w:t xml:space="preserve">5,476</w:t>
+              <w:t xml:space="preserve">5,900</w:t>
             </w:r>
           </w:p>
         </w:tc>
@@ -12952,7 +12952,7 @@
                 <w:szCs w:val="22"/>
                 <w:color w:val="000000"/>
               </w:rPr>
-              <w:t xml:space="preserve">Limpia pero el outcome mezcla dos aumentos del mínimo</w:t>
+              <w:t xml:space="preserve">Sin traslape, pero mezcla dos aumentos del mínimo y parte de 2021 (pospandemia)</w:t>
             </w:r>
           </w:p>
         </w:tc>
@@ -13012,7 +13012,7 @@
                 <w:szCs w:val="22"/>
                 <w:color w:val="000000"/>
               </w:rPr>
-              <w:t xml:space="preserve">Golpe costo</w:t>
+              <w:t xml:space="preserve">Proporción de obreros</w:t>
             </w:r>
           </w:p>
         </w:tc>
@@ -13122,7 +13122,7 @@
                 <w:szCs w:val="22"/>
                 <w:color w:val="000000"/>
               </w:rPr>
-              <w:t xml:space="preserve">1.017</w:t>
+              <w:t xml:space="preserve">0.425</w:t>
             </w:r>
           </w:p>
         </w:tc>
@@ -13177,7 +13177,7 @@
                 <w:szCs w:val="22"/>
                 <w:color w:val="000000"/>
               </w:rPr>
-              <w:t xml:space="preserve">0.030</w:t>
+              <w:t xml:space="preserve">0.355</w:t>
             </w:r>
           </w:p>
         </w:tc>
@@ -13232,7 +13232,7 @@
                 <w:szCs w:val="22"/>
                 <w:color w:val="000000"/>
               </w:rPr>
-              <w:t xml:space="preserve">**</w:t>
+              <w:t xml:space="preserve"/>
             </w:r>
           </w:p>
         </w:tc>
@@ -13287,7 +13287,7 @@
                 <w:szCs w:val="22"/>
                 <w:color w:val="000000"/>
               </w:rPr>
-              <w:t xml:space="preserve">5,486</w:t>
+              <w:t xml:space="preserve">5,912</w:t>
             </w:r>
           </w:p>
         </w:tc>
@@ -13402,7 +13402,7 @@
                 <w:szCs w:val="22"/>
                 <w:color w:val="000000"/>
               </w:rPr>
-              <w:t xml:space="preserve">Golpe costo</w:t>
+              <w:t xml:space="preserve">Proporción de obreros</w:t>
             </w:r>
           </w:p>
         </w:tc>
@@ -13512,7 +13512,7 @@
                 <w:szCs w:val="22"/>
                 <w:color w:val="000000"/>
               </w:rPr>
-              <w:t xml:space="preserve">-4.745</w:t>
+              <w:t xml:space="preserve">-0.065</w:t>
             </w:r>
           </w:p>
         </w:tc>
@@ -13567,7 +13567,7 @@
                 <w:szCs w:val="22"/>
                 <w:color w:val="000000"/>
               </w:rPr>
-              <w:t xml:space="preserve">0.000</w:t>
+              <w:t xml:space="preserve">0.909</w:t>
             </w:r>
           </w:p>
         </w:tc>
@@ -13622,7 +13622,7 @@
                 <w:szCs w:val="22"/>
                 <w:color w:val="000000"/>
               </w:rPr>
-              <w:t xml:space="preserve">***</w:t>
+              <w:t xml:space="preserve"/>
             </w:r>
           </w:p>
         </w:tc>
@@ -13677,7 +13677,7 @@
                 <w:szCs w:val="22"/>
                 <w:color w:val="000000"/>
               </w:rPr>
-              <w:t xml:space="preserve">5,843</w:t>
+              <w:t xml:space="preserve">5,917</w:t>
             </w:r>
           </w:p>
         </w:tc>
@@ -13792,7 +13792,7 @@
                 <w:szCs w:val="22"/>
                 <w:color w:val="000000"/>
               </w:rPr>
-              <w:t xml:space="preserve">Golpe costo</w:t>
+              <w:t xml:space="preserve">Proporción de obreros</w:t>
             </w:r>
           </w:p>
         </w:tc>
@@ -13902,7 +13902,7 @@
                 <w:szCs w:val="22"/>
                 <w:color w:val="000000"/>
               </w:rPr>
-              <w:t xml:space="preserve">0.583</w:t>
+              <w:t xml:space="preserve">0.678</w:t>
             </w:r>
           </w:p>
         </w:tc>
@@ -13957,7 +13957,7 @@
                 <w:szCs w:val="22"/>
                 <w:color w:val="000000"/>
               </w:rPr>
-              <w:t xml:space="preserve">0.435</w:t>
+              <w:t xml:space="preserve">0.303</w:t>
             </w:r>
           </w:p>
         </w:tc>
@@ -14067,7 +14067,7 @@
                 <w:szCs w:val="22"/>
                 <w:color w:val="000000"/>
               </w:rPr>
-              <w:t xml:space="preserve">5,896</w:t>
+              <w:t xml:space="preserve">5,971</w:t>
             </w:r>
           </w:p>
         </w:tc>
@@ -14182,7 +14182,7 @@
                 <w:szCs w:val="22"/>
                 <w:color w:val="000000"/>
               </w:rPr>
-              <w:t xml:space="preserve">Golpe costo</w:t>
+              <w:t xml:space="preserve">Proporción de obreros</w:t>
             </w:r>
           </w:p>
         </w:tc>
@@ -14292,7 +14292,7 @@
                 <w:szCs w:val="22"/>
                 <w:color w:val="000000"/>
               </w:rPr>
-              <w:t xml:space="preserve">9.597</w:t>
+              <w:t xml:space="preserve">0.170</w:t>
             </w:r>
           </w:p>
         </w:tc>
@@ -14347,7 +14347,7 @@
                 <w:szCs w:val="22"/>
                 <w:color w:val="000000"/>
               </w:rPr>
-              <w:t xml:space="preserve">0.000</w:t>
+              <w:t xml:space="preserve">0.736</w:t>
             </w:r>
           </w:p>
         </w:tc>
@@ -14402,7 +14402,7 @@
                 <w:szCs w:val="22"/>
                 <w:color w:val="000000"/>
               </w:rPr>
-              <w:t xml:space="preserve">***</w:t>
+              <w:t xml:space="preserve"/>
             </w:r>
           </w:p>
         </w:tc>
@@ -14457,7 +14457,7 @@
                 <w:szCs w:val="22"/>
                 <w:color w:val="000000"/>
               </w:rPr>
-              <w:t xml:space="preserve">5,942</w:t>
+              <w:t xml:space="preserve">6,017</w:t>
             </w:r>
           </w:p>
         </w:tc>
@@ -14551,7 +14551,7 @@
         <w:tblLook w:firstRow="1" w:lastRow="0" w:firstColumn="0" w:lastColumn="0" w:noHBand="0" w:noVBand="1"/>
       </w:tblPr>
       <w:tblGrid>
-        <w:gridCol w:w="1585"/>
+        <w:gridCol w:w="2587"/>
         <w:gridCol w:w="1316"/>
         <w:gridCol w:w="1206"/>
         <w:gridCol w:w="1389"/>
@@ -14837,7 +14837,7 @@
                 <w:szCs w:val="22"/>
                 <w:color w:val="000000"/>
               </w:rPr>
-              <w:t xml:space="preserve">Exposure</w:t>
+              <w:t xml:space="preserve">Proporción de obreros</w:t>
             </w:r>
           </w:p>
         </w:tc>
@@ -15062,7 +15062,7 @@
                 <w:szCs w:val="22"/>
                 <w:color w:val="000000"/>
               </w:rPr>
-              <w:t xml:space="preserve">Golpe A</w:t>
+              <w:t xml:space="preserve">Golpe costo</w:t>
             </w:r>
           </w:p>
         </w:tc>
@@ -15117,7 +15117,7 @@
                 <w:szCs w:val="22"/>
                 <w:color w:val="000000"/>
               </w:rPr>
-              <w:t xml:space="preserve">5,409</w:t>
+              <w:t xml:space="preserve">6,068</w:t>
             </w:r>
           </w:p>
         </w:tc>
@@ -15172,7 +15172,7 @@
                 <w:szCs w:val="22"/>
                 <w:color w:val="000000"/>
               </w:rPr>
-              <w:t xml:space="preserve">0.7322</w:t>
+              <w:t xml:space="preserve">0.7382</w:t>
             </w:r>
           </w:p>
         </w:tc>
@@ -15227,7 +15227,7 @@
                 <w:szCs w:val="22"/>
                 <w:color w:val="000000"/>
               </w:rPr>
-              <w:t xml:space="preserve">0.7384</w:t>
+              <w:t xml:space="preserve">0.7544</w:t>
             </w:r>
           </w:p>
         </w:tc>
@@ -15287,7 +15287,7 @@
                 <w:szCs w:val="22"/>
                 <w:color w:val="000000"/>
               </w:rPr>
-              <w:t xml:space="preserve">Golpe costo</w:t>
+              <w:t xml:space="preserve">Golpe A</w:t>
             </w:r>
           </w:p>
         </w:tc>
@@ -15342,7 +15342,7 @@
                 <w:szCs w:val="22"/>
                 <w:color w:val="000000"/>
               </w:rPr>
-              <w:t xml:space="preserve">5,557</w:t>
+              <w:t xml:space="preserve">5,485</w:t>
             </w:r>
           </w:p>
         </w:tc>
@@ -15397,7 +15397,7 @@
                 <w:szCs w:val="22"/>
                 <w:color w:val="000000"/>
               </w:rPr>
-              <w:t xml:space="preserve">0.7316</w:t>
+              <w:t xml:space="preserve">0.7194</w:t>
             </w:r>
           </w:p>
         </w:tc>
@@ -15452,7 +15452,7 @@
                 <w:szCs w:val="22"/>
                 <w:color w:val="000000"/>
               </w:rPr>
-              <w:t xml:space="preserve">0.7371</w:t>
+              <w:t xml:space="preserve">0.7330</w:t>
             </w:r>
           </w:p>
         </w:tc>
@@ -15567,7 +15567,7 @@
                 <w:szCs w:val="22"/>
                 <w:color w:val="000000"/>
               </w:rPr>
-              <w:t xml:space="preserve">5,436</w:t>
+              <w:t xml:space="preserve">5,485</w:t>
             </w:r>
           </w:p>
         </w:tc>
@@ -15622,7 +15622,7 @@
                 <w:szCs w:val="22"/>
                 <w:color w:val="000000"/>
               </w:rPr>
-              <w:t xml:space="preserve">0.7228</w:t>
+              <w:t xml:space="preserve">0.7177</w:t>
             </w:r>
           </w:p>
         </w:tc>
@@ -15677,7 +15677,7 @@
                 <w:szCs w:val="22"/>
                 <w:color w:val="000000"/>
               </w:rPr>
-              <w:t xml:space="preserve">0.7233</w:t>
+              <w:t xml:space="preserve">0.7202</w:t>
             </w:r>
           </w:p>
         </w:tc>
@@ -15737,7 +15737,7 @@
                 <w:szCs w:val="22"/>
                 <w:color w:val="000000"/>
               </w:rPr>
-              <w:t xml:space="preserve">Bite</w:t>
+              <w:t xml:space="preserve">Kaitz de obreros</w:t>
             </w:r>
           </w:p>
         </w:tc>
@@ -15792,7 +15792,7 @@
                 <w:szCs w:val="22"/>
                 <w:color w:val="000000"/>
               </w:rPr>
-              <w:t xml:space="preserve">3,691</w:t>
+              <w:t xml:space="preserve">4,744</w:t>
             </w:r>
           </w:p>
         </w:tc>
@@ -15847,7 +15847,7 @@
                 <w:szCs w:val="22"/>
                 <w:color w:val="000000"/>
               </w:rPr>
-              <w:t xml:space="preserve">0.5699</w:t>
+              <w:t xml:space="preserve">0.5719</w:t>
             </w:r>
           </w:p>
         </w:tc>
@@ -15902,7 +15902,7 @@
                 <w:szCs w:val="22"/>
                 <w:color w:val="000000"/>
               </w:rPr>
-              <w:t xml:space="preserve">0.5525</w:t>
+              <w:t xml:space="preserve">0.5903</w:t>
             </w:r>
           </w:p>
         </w:tc>
@@ -15941,7 +15941,7 @@
         <w:tblLook w:firstRow="1" w:lastRow="0" w:firstColumn="0" w:lastColumn="0" w:noHBand="0" w:noVBand="1"/>
       </w:tblPr>
       <w:tblGrid>
-        <w:gridCol w:w="3089"/>
+        <w:gridCol w:w="3884"/>
         <w:gridCol w:w="985"/>
         <w:gridCol w:w="1462"/>
         <w:gridCol w:w="1854"/>
@@ -16339,7 +16339,7 @@
                 <w:szCs w:val="22"/>
                 <w:color w:val="000000"/>
               </w:rPr>
-              <w:t xml:space="preserve">Bite (exp. 2022)</w:t>
+              <w:t xml:space="preserve">Kaitz de obreros (exp. 2022)</w:t>
             </w:r>
           </w:p>
         </w:tc>
@@ -16674,7 +16674,7 @@
                 <w:szCs w:val="22"/>
                 <w:color w:val="000000"/>
               </w:rPr>
-              <w:t xml:space="preserve">Bite (exp. 2022)</w:t>
+              <w:t xml:space="preserve">Kaitz de obreros (exp. 2022)</w:t>
             </w:r>
           </w:p>
         </w:tc>
@@ -16784,7 +16784,7 @@
                 <w:szCs w:val="22"/>
                 <w:color w:val="000000"/>
               </w:rPr>
-              <w:t xml:space="preserve">0.0305</w:t>
+              <w:t xml:space="preserve">0.0225</w:t>
             </w:r>
           </w:p>
         </w:tc>
@@ -16839,7 +16839,7 @@
                 <w:szCs w:val="22"/>
                 <w:color w:val="000000"/>
               </w:rPr>
-              <w:t xml:space="preserve">0.0134</w:t>
+              <w:t xml:space="preserve">0.0129</w:t>
             </w:r>
           </w:p>
         </w:tc>
@@ -16894,7 +16894,7 @@
                 <w:szCs w:val="22"/>
                 <w:color w:val="000000"/>
               </w:rPr>
-              <w:t xml:space="preserve">0.0235</w:t>
+              <w:t xml:space="preserve">0.0824</w:t>
             </w:r>
           </w:p>
         </w:tc>
@@ -16949,7 +16949,7 @@
                 <w:szCs w:val="22"/>
                 <w:color w:val="000000"/>
               </w:rPr>
-              <w:t xml:space="preserve">**</w:t>
+              <w:t xml:space="preserve">*</w:t>
             </w:r>
           </w:p>
         </w:tc>
@@ -17009,7 +17009,7 @@
                 <w:szCs w:val="22"/>
                 <w:color w:val="000000"/>
               </w:rPr>
-              <w:t xml:space="preserve">Bite (exp. 2022)</w:t>
+              <w:t xml:space="preserve">Kaitz de obreros (exp. 2022)</w:t>
             </w:r>
           </w:p>
         </w:tc>
@@ -17119,7 +17119,7 @@
                 <w:szCs w:val="22"/>
                 <w:color w:val="000000"/>
               </w:rPr>
-              <w:t xml:space="preserve">0.0597</w:t>
+              <w:t xml:space="preserve">0.0479</w:t>
             </w:r>
           </w:p>
         </w:tc>
@@ -17174,7 +17174,7 @@
                 <w:szCs w:val="22"/>
                 <w:color w:val="000000"/>
               </w:rPr>
-              <w:t xml:space="preserve">0.0143</w:t>
+              <w:t xml:space="preserve">0.0133</w:t>
             </w:r>
           </w:p>
         </w:tc>
@@ -17229,7 +17229,7 @@
                 <w:szCs w:val="22"/>
                 <w:color w:val="000000"/>
               </w:rPr>
-              <w:t xml:space="preserve">0.0000</w:t>
+              <w:t xml:space="preserve">0.0003</w:t>
             </w:r>
           </w:p>
         </w:tc>
@@ -17344,7 +17344,7 @@
                 <w:szCs w:val="22"/>
                 <w:color w:val="000000"/>
               </w:rPr>
-              <w:t xml:space="preserve">Bite (exp. 2022)</w:t>
+              <w:t xml:space="preserve">Kaitz de obreros (exp. 2022)</w:t>
             </w:r>
           </w:p>
         </w:tc>
@@ -17454,7 +17454,7 @@
                 <w:szCs w:val="22"/>
                 <w:color w:val="000000"/>
               </w:rPr>
-              <w:t xml:space="preserve">0.0503</w:t>
+              <w:t xml:space="preserve">0.0319</w:t>
             </w:r>
           </w:p>
         </w:tc>
@@ -17509,7 +17509,7 @@
                 <w:szCs w:val="22"/>
                 <w:color w:val="000000"/>
               </w:rPr>
-              <w:t xml:space="preserve">0.0151</w:t>
+              <w:t xml:space="preserve">0.0126</w:t>
             </w:r>
           </w:p>
         </w:tc>
@@ -17564,7 +17564,7 @@
                 <w:szCs w:val="22"/>
                 <w:color w:val="000000"/>
               </w:rPr>
-              <w:t xml:space="preserve">0.0009</w:t>
+              <w:t xml:space="preserve">0.0114</w:t>
             </w:r>
           </w:p>
         </w:tc>
@@ -17619,7 +17619,7 @@
                 <w:szCs w:val="22"/>
                 <w:color w:val="000000"/>
               </w:rPr>
-              <w:t xml:space="preserve">***</w:t>
+              <w:t xml:space="preserve">**</w:t>
             </w:r>
           </w:p>
         </w:tc>
@@ -17679,7 +17679,7 @@
                 <w:szCs w:val="22"/>
                 <w:color w:val="000000"/>
               </w:rPr>
-              <w:t xml:space="preserve">Bite (exp. 2022)</w:t>
+              <w:t xml:space="preserve">Kaitz de obreros (exp. 2022)</w:t>
             </w:r>
           </w:p>
         </w:tc>
@@ -17789,7 +17789,7 @@
                 <w:szCs w:val="22"/>
                 <w:color w:val="000000"/>
               </w:rPr>
-              <w:t xml:space="preserve">0.0822</w:t>
+              <w:t xml:space="preserve">0.0736</w:t>
             </w:r>
           </w:p>
         </w:tc>
@@ -17844,7 +17844,7 @@
                 <w:szCs w:val="22"/>
                 <w:color w:val="000000"/>
               </w:rPr>
-              <w:t xml:space="preserve">0.0152</w:t>
+              <w:t xml:space="preserve">0.0137</w:t>
             </w:r>
           </w:p>
         </w:tc>
@@ -18459,7 +18459,7 @@
                 <w:szCs w:val="22"/>
                 <w:color w:val="000000"/>
               </w:rPr>
-              <w:t xml:space="preserve">0.0488</w:t>
+              <w:t xml:space="preserve">0.0456</w:t>
             </w:r>
           </w:p>
         </w:tc>
@@ -18514,7 +18514,7 @@
                 <w:szCs w:val="22"/>
                 <w:color w:val="000000"/>
               </w:rPr>
-              <w:t xml:space="preserve">0.0123</w:t>
+              <w:t xml:space="preserve">0.0125</w:t>
             </w:r>
           </w:p>
         </w:tc>
@@ -18569,7 +18569,7 @@
                 <w:szCs w:val="22"/>
                 <w:color w:val="000000"/>
               </w:rPr>
-              <w:t xml:space="preserve">0.0001</w:t>
+              <w:t xml:space="preserve">0.0003</w:t>
             </w:r>
           </w:p>
         </w:tc>
@@ -18794,7 +18794,7 @@
                 <w:szCs w:val="22"/>
                 <w:color w:val="000000"/>
               </w:rPr>
-              <w:t xml:space="preserve">0.0579</w:t>
+              <w:t xml:space="preserve">0.0457</w:t>
             </w:r>
           </w:p>
         </w:tc>
@@ -18904,7 +18904,7 @@
                 <w:szCs w:val="22"/>
                 <w:color w:val="000000"/>
               </w:rPr>
-              <w:t xml:space="preserve">0.0000</w:t>
+              <w:t xml:space="preserve">0.0002</w:t>
             </w:r>
           </w:p>
         </w:tc>
@@ -19129,7 +19129,7 @@
                 <w:szCs w:val="22"/>
                 <w:color w:val="000000"/>
               </w:rPr>
-              <w:t xml:space="preserve">0.0808</w:t>
+              <w:t xml:space="preserve">0.0634</w:t>
             </w:r>
           </w:p>
         </w:tc>
@@ -19184,7 +19184,7 @@
                 <w:szCs w:val="22"/>
                 <w:color w:val="000000"/>
               </w:rPr>
-              <w:t xml:space="preserve">0.0129</w:t>
+              <w:t xml:space="preserve">0.0124</w:t>
             </w:r>
           </w:p>
         </w:tc>
@@ -19464,7 +19464,7 @@
                 <w:szCs w:val="22"/>
                 <w:color w:val="000000"/>
               </w:rPr>
-              <w:t xml:space="preserve">0.1023</w:t>
+              <w:t xml:space="preserve">0.0843</w:t>
             </w:r>
           </w:p>
         </w:tc>
@@ -19519,7 +19519,7 @@
                 <w:szCs w:val="22"/>
                 <w:color w:val="000000"/>
               </w:rPr>
-              <w:t xml:space="preserve">0.0144</w:t>
+              <w:t xml:space="preserve">0.0135</w:t>
             </w:r>
           </w:p>
         </w:tc>
@@ -19689,7 +19689,7 @@
                 <w:szCs w:val="22"/>
                 <w:color w:val="000000"/>
               </w:rPr>
-              <w:t xml:space="preserve">Bite (exp. 2019, limpia)</w:t>
+              <w:t xml:space="preserve">Kaitz de obreros (exp. 2019, limpia)</w:t>
             </w:r>
           </w:p>
         </w:tc>
@@ -20024,7 +20024,7 @@
                 <w:szCs w:val="22"/>
                 <w:color w:val="000000"/>
               </w:rPr>
-              <w:t xml:space="preserve">Bite (exp. 2019, limpia)</w:t>
+              <w:t xml:space="preserve">Kaitz de obreros (exp. 2019, limpia)</w:t>
             </w:r>
           </w:p>
         </w:tc>
@@ -20134,7 +20134,7 @@
                 <w:szCs w:val="22"/>
                 <w:color w:val="000000"/>
               </w:rPr>
-              <w:t xml:space="preserve">0.0006</w:t>
+              <w:t xml:space="preserve">-0.0032</w:t>
             </w:r>
           </w:p>
         </w:tc>
@@ -20189,7 +20189,7 @@
                 <w:szCs w:val="22"/>
                 <w:color w:val="000000"/>
               </w:rPr>
-              <w:t xml:space="preserve">0.0129</w:t>
+              <w:t xml:space="preserve">0.0114</w:t>
             </w:r>
           </w:p>
         </w:tc>
@@ -20244,7 +20244,7 @@
                 <w:szCs w:val="22"/>
                 <w:color w:val="000000"/>
               </w:rPr>
-              <w:t xml:space="preserve">0.9628</w:t>
+              <w:t xml:space="preserve">0.7794</w:t>
             </w:r>
           </w:p>
         </w:tc>
@@ -20359,7 +20359,7 @@
                 <w:szCs w:val="22"/>
                 <w:color w:val="000000"/>
               </w:rPr>
-              <w:t xml:space="preserve">Bite (exp. 2019, limpia)</w:t>
+              <w:t xml:space="preserve">Kaitz de obreros (exp. 2019, limpia)</w:t>
             </w:r>
           </w:p>
         </w:tc>
@@ -20469,7 +20469,7 @@
                 <w:szCs w:val="22"/>
                 <w:color w:val="000000"/>
               </w:rPr>
-              <w:t xml:space="preserve">0.0268</w:t>
+              <w:t xml:space="preserve">0.0205</w:t>
             </w:r>
           </w:p>
         </w:tc>
@@ -20524,7 +20524,7 @@
                 <w:szCs w:val="22"/>
                 <w:color w:val="000000"/>
               </w:rPr>
-              <w:t xml:space="preserve">0.0138</w:t>
+              <w:t xml:space="preserve">0.0112</w:t>
             </w:r>
           </w:p>
         </w:tc>
@@ -20579,7 +20579,7 @@
                 <w:szCs w:val="22"/>
                 <w:color w:val="000000"/>
               </w:rPr>
-              <w:t xml:space="preserve">0.0528</w:t>
+              <w:t xml:space="preserve">0.0654</w:t>
             </w:r>
           </w:p>
         </w:tc>
@@ -20694,7 +20694,7 @@
                 <w:szCs w:val="22"/>
                 <w:color w:val="000000"/>
               </w:rPr>
-              <w:t xml:space="preserve">Bite (exp. 2019, limpia)</w:t>
+              <w:t xml:space="preserve">Kaitz de obreros (exp. 2019, limpia)</w:t>
             </w:r>
           </w:p>
         </w:tc>
@@ -20804,7 +20804,7 @@
                 <w:szCs w:val="22"/>
                 <w:color w:val="000000"/>
               </w:rPr>
-              <w:t xml:space="preserve">0.0274</w:t>
+              <w:t xml:space="preserve">0.0246</w:t>
             </w:r>
           </w:p>
         </w:tc>
@@ -20859,7 +20859,7 @@
                 <w:szCs w:val="22"/>
                 <w:color w:val="000000"/>
               </w:rPr>
-              <w:t xml:space="preserve">0.0138</w:t>
+              <w:t xml:space="preserve">0.0122</w:t>
             </w:r>
           </w:p>
         </w:tc>
@@ -20914,7 +20914,7 @@
                 <w:szCs w:val="22"/>
                 <w:color w:val="000000"/>
               </w:rPr>
-              <w:t xml:space="preserve">0.0476</w:t>
+              <w:t xml:space="preserve">0.0442</w:t>
             </w:r>
           </w:p>
         </w:tc>
@@ -21029,7 +21029,7 @@
                 <w:szCs w:val="22"/>
                 <w:color w:val="000000"/>
               </w:rPr>
-              <w:t xml:space="preserve">Bite (exp. 2019, limpia)</w:t>
+              <w:t xml:space="preserve">Kaitz de obreros (exp. 2019, limpia)</w:t>
             </w:r>
           </w:p>
         </w:tc>
@@ -21139,7 +21139,7 @@
                 <w:szCs w:val="22"/>
                 <w:color w:val="000000"/>
               </w:rPr>
-              <w:t xml:space="preserve">0.0227</w:t>
+              <w:t xml:space="preserve">0.0138</w:t>
             </w:r>
           </w:p>
         </w:tc>
@@ -21194,7 +21194,7 @@
                 <w:szCs w:val="22"/>
                 <w:color w:val="000000"/>
               </w:rPr>
-              <w:t xml:space="preserve">0.0129</w:t>
+              <w:t xml:space="preserve">0.0111</w:t>
             </w:r>
           </w:p>
         </w:tc>
@@ -21249,7 +21249,7 @@
                 <w:szCs w:val="22"/>
                 <w:color w:val="000000"/>
               </w:rPr>
-              <w:t xml:space="preserve">0.0795</w:t>
+              <w:t xml:space="preserve">0.2142</w:t>
             </w:r>
           </w:p>
         </w:tc>
@@ -21304,7 +21304,7 @@
                 <w:szCs w:val="22"/>
                 <w:color w:val="000000"/>
               </w:rPr>
-              <w:t xml:space="preserve">*</w:t>
+              <w:t xml:space="preserve"/>
             </w:r>
           </w:p>
         </w:tc>
@@ -21809,7 +21809,7 @@
                 <w:szCs w:val="22"/>
                 <w:color w:val="000000"/>
               </w:rPr>
-              <w:t xml:space="preserve">0.0078</w:t>
+              <w:t xml:space="preserve">0.0059</w:t>
             </w:r>
           </w:p>
         </w:tc>
@@ -21919,7 +21919,7 @@
                 <w:szCs w:val="22"/>
                 <w:color w:val="000000"/>
               </w:rPr>
-              <w:t xml:space="preserve">0.4643</w:t>
+              <w:t xml:space="preserve">0.5763</w:t>
             </w:r>
           </w:p>
         </w:tc>
@@ -22144,7 +22144,7 @@
                 <w:szCs w:val="22"/>
                 <w:color w:val="000000"/>
               </w:rPr>
-              <w:t xml:space="preserve">0.0408</w:t>
+              <w:t xml:space="preserve">0.0346</w:t>
             </w:r>
           </w:p>
         </w:tc>
@@ -22199,7 +22199,7 @@
                 <w:szCs w:val="22"/>
                 <w:color w:val="000000"/>
               </w:rPr>
-              <w:t xml:space="preserve">0.0123</w:t>
+              <w:t xml:space="preserve">0.0122</w:t>
             </w:r>
           </w:p>
         </w:tc>
@@ -22254,7 +22254,7 @@
                 <w:szCs w:val="22"/>
                 <w:color w:val="000000"/>
               </w:rPr>
-              <w:t xml:space="preserve">0.0010</w:t>
+              <w:t xml:space="preserve">0.0045</w:t>
             </w:r>
           </w:p>
         </w:tc>
@@ -22479,7 +22479,7 @@
                 <w:szCs w:val="22"/>
                 <w:color w:val="000000"/>
               </w:rPr>
-              <w:t xml:space="preserve">0.0344</w:t>
+              <w:t xml:space="preserve">0.0259</w:t>
             </w:r>
           </w:p>
         </w:tc>
@@ -22534,7 +22534,7 @@
                 <w:szCs w:val="22"/>
                 <w:color w:val="000000"/>
               </w:rPr>
-              <w:t xml:space="preserve">0.0136</w:t>
+              <w:t xml:space="preserve">0.0126</w:t>
             </w:r>
           </w:p>
         </w:tc>
@@ -22589,7 +22589,7 @@
                 <w:szCs w:val="22"/>
                 <w:color w:val="000000"/>
               </w:rPr>
-              <w:t xml:space="preserve">0.0117</w:t>
+              <w:t xml:space="preserve">0.0397</w:t>
             </w:r>
           </w:p>
         </w:tc>
@@ -22814,7 +22814,7 @@
                 <w:szCs w:val="22"/>
                 <w:color w:val="000000"/>
               </w:rPr>
-              <w:t xml:space="preserve">0.0233</w:t>
+              <w:t xml:space="preserve">0.0147</w:t>
             </w:r>
           </w:p>
         </w:tc>
@@ -22869,7 +22869,7 @@
                 <w:szCs w:val="22"/>
                 <w:color w:val="000000"/>
               </w:rPr>
-              <w:t xml:space="preserve">0.0139</w:t>
+              <w:t xml:space="preserve">0.0125</w:t>
             </w:r>
           </w:p>
         </w:tc>
@@ -22924,7 +22924,7 @@
                 <w:szCs w:val="22"/>
                 <w:color w:val="000000"/>
               </w:rPr>
-              <w:t xml:space="preserve">0.0927</w:t>
+              <w:t xml:space="preserve">0.2391</w:t>
             </w:r>
           </w:p>
         </w:tc>
@@ -22979,7 +22979,7 @@
                 <w:szCs w:val="22"/>
                 <w:color w:val="000000"/>
               </w:rPr>
-              <w:t xml:space="preserve">*</w:t>
+              <w:t xml:space="preserve"/>
             </w:r>
           </w:p>
         </w:tc>
@@ -23018,7 +23018,7 @@
         <w:tblLook w:firstRow="1" w:lastRow="0" w:firstColumn="0" w:lastColumn="0" w:noHBand="0" w:noVBand="1"/>
       </w:tblPr>
       <w:tblGrid>
-        <w:gridCol w:w="1585"/>
+        <w:gridCol w:w="2587"/>
         <w:gridCol w:w="3150"/>
         <w:gridCol w:w="2123"/>
         <w:gridCol w:w="1230"/>
@@ -23584,7 +23584,7 @@
                 <w:szCs w:val="22"/>
                 <w:color w:val="000000"/>
               </w:rPr>
-              <w:t xml:space="preserve">Bite</w:t>
+              <w:t xml:space="preserve">Kaitz de obreros</w:t>
             </w:r>
           </w:p>
         </w:tc>
@@ -23694,7 +23694,7 @@
                 <w:szCs w:val="22"/>
                 <w:color w:val="000000"/>
               </w:rPr>
-              <w:t xml:space="preserve">1.145</w:t>
+              <w:t xml:space="preserve">0.825</w:t>
             </w:r>
           </w:p>
         </w:tc>
@@ -23749,7 +23749,7 @@
                 <w:szCs w:val="22"/>
                 <w:color w:val="000000"/>
               </w:rPr>
-              <w:t xml:space="preserve">0.008</w:t>
+              <w:t xml:space="preserve">0.023</w:t>
             </w:r>
           </w:p>
         </w:tc>
@@ -23859,7 +23859,7 @@
                 <w:szCs w:val="22"/>
                 <w:color w:val="000000"/>
               </w:rPr>
-              <w:t xml:space="preserve">2.983</w:t>
+              <w:t xml:space="preserve">2.866</w:t>
             </w:r>
           </w:p>
         </w:tc>
@@ -23914,7 +23914,7 @@
                 <w:szCs w:val="22"/>
                 <w:color w:val="000000"/>
               </w:rPr>
-              <w:t xml:space="preserve">0.570</w:t>
+              <w:t xml:space="preserve">0.572</w:t>
             </w:r>
           </w:p>
         </w:tc>
@@ -23969,7 +23969,7 @@
                 <w:szCs w:val="22"/>
                 <w:color w:val="000000"/>
               </w:rPr>
-              <w:t xml:space="preserve">3,880</w:t>
+              <w:t xml:space="preserve">4,930</w:t>
             </w:r>
           </w:p>
         </w:tc>
@@ -24024,7 +24024,7 @@
                 <w:szCs w:val="22"/>
                 <w:color w:val="000000"/>
               </w:rPr>
-              <w:t xml:space="preserve">0.384</w:t>
+              <w:t xml:space="preserve">0.288</w:t>
             </w:r>
           </w:p>
         </w:tc>
@@ -24084,7 +24084,7 @@
                 <w:szCs w:val="22"/>
                 <w:color w:val="000000"/>
               </w:rPr>
-              <w:t xml:space="preserve">Golpe costo</w:t>
+              <w:t xml:space="preserve">Golpe A</w:t>
             </w:r>
           </w:p>
         </w:tc>
@@ -24139,6 +24139,171 @@
                 <w:szCs w:val="22"/>
                 <w:color w:val="000000"/>
               </w:rPr>
+              <w:t xml:space="preserve">No</w:t>
+            </w:r>
+          </w:p>
+        </w:tc>
+        <w:tc>
+          <w:tcPr>
+            <w:tcBorders>
+              <w:bottom w:val="none" w:sz="0" w:space="0" w:color="000000"/>
+              <w:top w:val="none" w:sz="0" w:space="0" w:color="000000"/>
+              <w:left w:val="none" w:sz="0" w:space="0" w:color="000000"/>
+              <w:right w:val="none" w:sz="0" w:space="0" w:color="000000"/>
+            </w:tcBorders>
+            <w:shd w:val="clear" w:color="auto" w:fill="FFFFFF"/>
+            <w:tcMar>
+              <w:top w:w="0" w:type="dxa"/>
+              <w:bottom w:w="0" w:type="dxa"/>
+              <w:left w:w="0" w:type="dxa"/>
+              <w:right w:w="0" w:type="dxa"/>
+            </w:tcMar>
+            <w:vAlign w:val="center"/>
+          </w:tcPr>
+          <w:p>
+            <w:pPr>
+              <w:pStyle w:val="Normal"/>
+              <w:jc w:val="right"/>
+              <w:pBdr>
+                <w:bottom w:val="none" w:sz="0" w:space="0" w:color="000000"/>
+                <w:top w:val="none" w:sz="0" w:space="0" w:color="000000"/>
+                <w:left w:val="none" w:sz="0" w:space="0" w:color="000000"/>
+                <w:right w:val="none" w:sz="0" w:space="0" w:color="000000"/>
+              </w:pBdr>
+              <w:spacing w:after="100" w:before="100" w:line="240"/>
+              <w:ind w:left="100" w:right="100" w:firstLine="0" w:firstLineChars="0"/>
+              <w:rPr>
+                <w:rFonts w:ascii="Arial" w:hAnsi="Arial" w:eastAsia="Arial" w:cs="Arial"/>
+                <w:i w:val="false"/>
+                <w:b w:val="false"/>
+                <w:u w:val="none"/>
+                <w:strike w:val="false"/>
+                <w:sz w:val="22"/>
+                <w:szCs w:val="22"/>
+                <w:color w:val="000000"/>
+              </w:rPr>
+            </w:pPr>
+            <w:r>
+              <w:rPr>
+                <w:rFonts w:ascii="Arial" w:hAnsi="Arial" w:eastAsia="Arial" w:cs="Arial"/>
+                <w:i w:val="false"/>
+                <w:b w:val="false"/>
+                <w:u w:val="none"/>
+                <w:strike w:val="false"/>
+                <w:sz w:val="22"/>
+                <w:szCs w:val="22"/>
+                <w:color w:val="000000"/>
+              </w:rPr>
+              <w:t xml:space="preserve">0.495</w:t>
+            </w:r>
+          </w:p>
+        </w:tc>
+        <w:tc>
+          <w:tcPr>
+            <w:tcBorders>
+              <w:bottom w:val="none" w:sz="0" w:space="0" w:color="000000"/>
+              <w:top w:val="none" w:sz="0" w:space="0" w:color="000000"/>
+              <w:left w:val="none" w:sz="0" w:space="0" w:color="000000"/>
+              <w:right w:val="none" w:sz="0" w:space="0" w:color="000000"/>
+            </w:tcBorders>
+            <w:shd w:val="clear" w:color="auto" w:fill="FFFFFF"/>
+            <w:tcMar>
+              <w:top w:w="0" w:type="dxa"/>
+              <w:bottom w:w="0" w:type="dxa"/>
+              <w:left w:w="0" w:type="dxa"/>
+              <w:right w:w="0" w:type="dxa"/>
+            </w:tcMar>
+            <w:vAlign w:val="center"/>
+          </w:tcPr>
+          <w:p>
+            <w:pPr>
+              <w:pStyle w:val="Normal"/>
+              <w:jc w:val="right"/>
+              <w:pBdr>
+                <w:bottom w:val="none" w:sz="0" w:space="0" w:color="000000"/>
+                <w:top w:val="none" w:sz="0" w:space="0" w:color="000000"/>
+                <w:left w:val="none" w:sz="0" w:space="0" w:color="000000"/>
+                <w:right w:val="none" w:sz="0" w:space="0" w:color="000000"/>
+              </w:pBdr>
+              <w:spacing w:after="100" w:before="100" w:line="240"/>
+              <w:ind w:left="100" w:right="100" w:firstLine="0" w:firstLineChars="0"/>
+              <w:rPr>
+                <w:rFonts w:ascii="Arial" w:hAnsi="Arial" w:eastAsia="Arial" w:cs="Arial"/>
+                <w:i w:val="false"/>
+                <w:b w:val="false"/>
+                <w:u w:val="none"/>
+                <w:strike w:val="false"/>
+                <w:sz w:val="22"/>
+                <w:szCs w:val="22"/>
+                <w:color w:val="000000"/>
+              </w:rPr>
+            </w:pPr>
+            <w:r>
+              <w:rPr>
+                <w:rFonts w:ascii="Arial" w:hAnsi="Arial" w:eastAsia="Arial" w:cs="Arial"/>
+                <w:i w:val="false"/>
+                <w:b w:val="false"/>
+                <w:u w:val="none"/>
+                <w:strike w:val="false"/>
+                <w:sz w:val="22"/>
+                <w:szCs w:val="22"/>
+                <w:color w:val="000000"/>
+              </w:rPr>
+              <w:t xml:space="preserve">0.169</w:t>
+            </w:r>
+          </w:p>
+        </w:tc>
+        <w:tc>
+          <w:tcPr>
+            <w:tcBorders>
+              <w:bottom w:val="none" w:sz="0" w:space="0" w:color="000000"/>
+              <w:top w:val="none" w:sz="0" w:space="0" w:color="000000"/>
+              <w:left w:val="none" w:sz="0" w:space="0" w:color="000000"/>
+              <w:right w:val="none" w:sz="0" w:space="0" w:color="000000"/>
+            </w:tcBorders>
+            <w:shd w:val="clear" w:color="auto" w:fill="FFFFFF"/>
+            <w:tcMar>
+              <w:top w:w="0" w:type="dxa"/>
+              <w:bottom w:w="0" w:type="dxa"/>
+              <w:left w:w="0" w:type="dxa"/>
+              <w:right w:w="0" w:type="dxa"/>
+            </w:tcMar>
+            <w:vAlign w:val="center"/>
+          </w:tcPr>
+          <w:p>
+            <w:pPr>
+              <w:pStyle w:val="Normal"/>
+              <w:jc w:val="left"/>
+              <w:pBdr>
+                <w:bottom w:val="none" w:sz="0" w:space="0" w:color="000000"/>
+                <w:top w:val="none" w:sz="0" w:space="0" w:color="000000"/>
+                <w:left w:val="none" w:sz="0" w:space="0" w:color="000000"/>
+                <w:right w:val="none" w:sz="0" w:space="0" w:color="000000"/>
+              </w:pBdr>
+              <w:spacing w:after="100" w:before="100" w:line="240"/>
+              <w:ind w:left="100" w:right="100" w:firstLine="0" w:firstLineChars="0"/>
+              <w:rPr>
+                <w:rFonts w:ascii="Arial" w:hAnsi="Arial" w:eastAsia="Arial" w:cs="Arial"/>
+                <w:i w:val="false"/>
+                <w:b w:val="false"/>
+                <w:u w:val="none"/>
+                <w:strike w:val="false"/>
+                <w:sz w:val="22"/>
+                <w:szCs w:val="22"/>
+                <w:color w:val="000000"/>
+              </w:rPr>
+            </w:pPr>
+            <w:r>
+              <w:rPr>
+                <w:rFonts w:ascii="Arial" w:hAnsi="Arial" w:eastAsia="Arial" w:cs="Arial"/>
+                <w:i w:val="false"/>
+                <w:b w:val="false"/>
+                <w:u w:val="none"/>
+                <w:strike w:val="false"/>
+                <w:sz w:val="22"/>
+                <w:szCs w:val="22"/>
+                <w:color w:val="000000"/>
+              </w:rPr>
               <w:t xml:space="preserve">Sí</w:t>
             </w:r>
           </w:p>
@@ -24194,7 +24359,7 @@
                 <w:szCs w:val="22"/>
                 <w:color w:val="000000"/>
               </w:rPr>
-              <w:t xml:space="preserve">1.017</w:t>
+              <w:t xml:space="preserve">3.190</w:t>
             </w:r>
           </w:p>
         </w:tc>
@@ -24249,62 +24414,7 @@
                 <w:szCs w:val="22"/>
                 <w:color w:val="000000"/>
               </w:rPr>
-              <w:t xml:space="preserve">0.030</w:t>
-            </w:r>
-          </w:p>
-        </w:tc>
-        <w:tc>
-          <w:tcPr>
-            <w:tcBorders>
-              <w:bottom w:val="none" w:sz="0" w:space="0" w:color="000000"/>
-              <w:top w:val="none" w:sz="0" w:space="0" w:color="000000"/>
-              <w:left w:val="none" w:sz="0" w:space="0" w:color="000000"/>
-              <w:right w:val="none" w:sz="0" w:space="0" w:color="000000"/>
-            </w:tcBorders>
-            <w:shd w:val="clear" w:color="auto" w:fill="FFFFFF"/>
-            <w:tcMar>
-              <w:top w:w="0" w:type="dxa"/>
-              <w:bottom w:w="0" w:type="dxa"/>
-              <w:left w:w="0" w:type="dxa"/>
-              <w:right w:w="0" w:type="dxa"/>
-            </w:tcMar>
-            <w:vAlign w:val="center"/>
-          </w:tcPr>
-          <w:p>
-            <w:pPr>
-              <w:pStyle w:val="Normal"/>
-              <w:jc w:val="left"/>
-              <w:pBdr>
-                <w:bottom w:val="none" w:sz="0" w:space="0" w:color="000000"/>
-                <w:top w:val="none" w:sz="0" w:space="0" w:color="000000"/>
-                <w:left w:val="none" w:sz="0" w:space="0" w:color="000000"/>
-                <w:right w:val="none" w:sz="0" w:space="0" w:color="000000"/>
-              </w:pBdr>
-              <w:spacing w:after="100" w:before="100" w:line="240"/>
-              <w:ind w:left="100" w:right="100" w:firstLine="0" w:firstLineChars="0"/>
-              <w:rPr>
-                <w:rFonts w:ascii="Arial" w:hAnsi="Arial" w:eastAsia="Arial" w:cs="Arial"/>
-                <w:i w:val="false"/>
-                <w:b w:val="false"/>
-                <w:u w:val="none"/>
-                <w:strike w:val="false"/>
-                <w:sz w:val="22"/>
-                <w:szCs w:val="22"/>
-                <w:color w:val="000000"/>
-              </w:rPr>
-            </w:pPr>
-            <w:r>
-              <w:rPr>
-                <w:rFonts w:ascii="Arial" w:hAnsi="Arial" w:eastAsia="Arial" w:cs="Arial"/>
-                <w:i w:val="false"/>
-                <w:b w:val="false"/>
-                <w:u w:val="none"/>
-                <w:strike w:val="false"/>
-                <w:sz w:val="22"/>
-                <w:szCs w:val="22"/>
-                <w:color w:val="000000"/>
-              </w:rPr>
-              <w:t xml:space="preserve">Sí</w:t>
+              <w:t xml:space="preserve">0.719</w:t>
             </w:r>
           </w:p>
         </w:tc>
@@ -24359,7 +24469,7 @@
                 <w:szCs w:val="22"/>
                 <w:color w:val="000000"/>
               </w:rPr>
-              <w:t xml:space="preserve">9.597</w:t>
+              <w:t xml:space="preserve">5,468</w:t>
             </w:r>
           </w:p>
         </w:tc>
@@ -24414,117 +24524,7 @@
                 <w:szCs w:val="22"/>
                 <w:color w:val="000000"/>
               </w:rPr>
-              <w:t xml:space="preserve">0.732</w:t>
-            </w:r>
-          </w:p>
-        </w:tc>
-        <w:tc>
-          <w:tcPr>
-            <w:tcBorders>
-              <w:bottom w:val="none" w:sz="0" w:space="0" w:color="000000"/>
-              <w:top w:val="none" w:sz="0" w:space="0" w:color="000000"/>
-              <w:left w:val="none" w:sz="0" w:space="0" w:color="000000"/>
-              <w:right w:val="none" w:sz="0" w:space="0" w:color="000000"/>
-            </w:tcBorders>
-            <w:shd w:val="clear" w:color="auto" w:fill="FFFFFF"/>
-            <w:tcMar>
-              <w:top w:w="0" w:type="dxa"/>
-              <w:bottom w:w="0" w:type="dxa"/>
-              <w:left w:w="0" w:type="dxa"/>
-              <w:right w:w="0" w:type="dxa"/>
-            </w:tcMar>
-            <w:vAlign w:val="center"/>
-          </w:tcPr>
-          <w:p>
-            <w:pPr>
-              <w:pStyle w:val="Normal"/>
-              <w:jc w:val="right"/>
-              <w:pBdr>
-                <w:bottom w:val="none" w:sz="0" w:space="0" w:color="000000"/>
-                <w:top w:val="none" w:sz="0" w:space="0" w:color="000000"/>
-                <w:left w:val="none" w:sz="0" w:space="0" w:color="000000"/>
-                <w:right w:val="none" w:sz="0" w:space="0" w:color="000000"/>
-              </w:pBdr>
-              <w:spacing w:after="100" w:before="100" w:line="240"/>
-              <w:ind w:left="100" w:right="100" w:firstLine="0" w:firstLineChars="0"/>
-              <w:rPr>
-                <w:rFonts w:ascii="Arial" w:hAnsi="Arial" w:eastAsia="Arial" w:cs="Arial"/>
-                <w:i w:val="false"/>
-                <w:b w:val="false"/>
-                <w:u w:val="none"/>
-                <w:strike w:val="false"/>
-                <w:sz w:val="22"/>
-                <w:szCs w:val="22"/>
-                <w:color w:val="000000"/>
-              </w:rPr>
-            </w:pPr>
-            <w:r>
-              <w:rPr>
-                <w:rFonts w:ascii="Arial" w:hAnsi="Arial" w:eastAsia="Arial" w:cs="Arial"/>
-                <w:i w:val="false"/>
-                <w:b w:val="false"/>
-                <w:u w:val="none"/>
-                <w:strike w:val="false"/>
-                <w:sz w:val="22"/>
-                <w:szCs w:val="22"/>
-                <w:color w:val="000000"/>
-              </w:rPr>
-              <w:t xml:space="preserve">5,486</w:t>
-            </w:r>
-          </w:p>
-        </w:tc>
-        <w:tc>
-          <w:tcPr>
-            <w:tcBorders>
-              <w:bottom w:val="none" w:sz="0" w:space="0" w:color="000000"/>
-              <w:top w:val="none" w:sz="0" w:space="0" w:color="000000"/>
-              <w:left w:val="none" w:sz="0" w:space="0" w:color="000000"/>
-              <w:right w:val="none" w:sz="0" w:space="0" w:color="000000"/>
-            </w:tcBorders>
-            <w:shd w:val="clear" w:color="auto" w:fill="FFFFFF"/>
-            <w:tcMar>
-              <w:top w:w="0" w:type="dxa"/>
-              <w:bottom w:w="0" w:type="dxa"/>
-              <w:left w:w="0" w:type="dxa"/>
-              <w:right w:w="0" w:type="dxa"/>
-            </w:tcMar>
-            <w:vAlign w:val="center"/>
-          </w:tcPr>
-          <w:p>
-            <w:pPr>
-              <w:pStyle w:val="Normal"/>
-              <w:jc w:val="right"/>
-              <w:pBdr>
-                <w:bottom w:val="none" w:sz="0" w:space="0" w:color="000000"/>
-                <w:top w:val="none" w:sz="0" w:space="0" w:color="000000"/>
-                <w:left w:val="none" w:sz="0" w:space="0" w:color="000000"/>
-                <w:right w:val="none" w:sz="0" w:space="0" w:color="000000"/>
-              </w:pBdr>
-              <w:spacing w:after="100" w:before="100" w:line="240"/>
-              <w:ind w:left="100" w:right="100" w:firstLine="0" w:firstLineChars="0"/>
-              <w:rPr>
-                <w:rFonts w:ascii="Arial" w:hAnsi="Arial" w:eastAsia="Arial" w:cs="Arial"/>
-                <w:i w:val="false"/>
-                <w:b w:val="false"/>
-                <w:u w:val="none"/>
-                <w:strike w:val="false"/>
-                <w:sz w:val="22"/>
-                <w:szCs w:val="22"/>
-                <w:color w:val="000000"/>
-              </w:rPr>
-            </w:pPr>
-            <w:r>
-              <w:rPr>
-                <w:rFonts w:ascii="Arial" w:hAnsi="Arial" w:eastAsia="Arial" w:cs="Arial"/>
-                <w:i w:val="false"/>
-                <w:b w:val="false"/>
-                <w:u w:val="none"/>
-                <w:strike w:val="false"/>
-                <w:sz w:val="22"/>
-                <w:szCs w:val="22"/>
-                <w:color w:val="000000"/>
-              </w:rPr>
-              <w:t xml:space="preserve">0.106</w:t>
+              <w:t xml:space="preserve">0.155</w:t>
             </w:r>
           </w:p>
         </w:tc>
@@ -24584,7 +24584,7 @@
                 <w:szCs w:val="22"/>
                 <w:color w:val="000000"/>
               </w:rPr>
-              <w:t xml:space="preserve">Golpe A</w:t>
+              <w:t xml:space="preserve">Golpe costo</w:t>
             </w:r>
           </w:p>
         </w:tc>
@@ -24639,6 +24639,171 @@
                 <w:szCs w:val="22"/>
                 <w:color w:val="000000"/>
               </w:rPr>
+              <w:t xml:space="preserve">No</w:t>
+            </w:r>
+          </w:p>
+        </w:tc>
+        <w:tc>
+          <w:tcPr>
+            <w:tcBorders>
+              <w:bottom w:val="none" w:sz="0" w:space="0" w:color="000000"/>
+              <w:top w:val="none" w:sz="0" w:space="0" w:color="000000"/>
+              <w:left w:val="none" w:sz="0" w:space="0" w:color="000000"/>
+              <w:right w:val="none" w:sz="0" w:space="0" w:color="000000"/>
+            </w:tcBorders>
+            <w:shd w:val="clear" w:color="auto" w:fill="FFFFFF"/>
+            <w:tcMar>
+              <w:top w:w="0" w:type="dxa"/>
+              <w:bottom w:w="0" w:type="dxa"/>
+              <w:left w:w="0" w:type="dxa"/>
+              <w:right w:w="0" w:type="dxa"/>
+            </w:tcMar>
+            <w:vAlign w:val="center"/>
+          </w:tcPr>
+          <w:p>
+            <w:pPr>
+              <w:pStyle w:val="Normal"/>
+              <w:jc w:val="right"/>
+              <w:pBdr>
+                <w:bottom w:val="none" w:sz="0" w:space="0" w:color="000000"/>
+                <w:top w:val="none" w:sz="0" w:space="0" w:color="000000"/>
+                <w:left w:val="none" w:sz="0" w:space="0" w:color="000000"/>
+                <w:right w:val="none" w:sz="0" w:space="0" w:color="000000"/>
+              </w:pBdr>
+              <w:spacing w:after="100" w:before="100" w:line="240"/>
+              <w:ind w:left="100" w:right="100" w:firstLine="0" w:firstLineChars="0"/>
+              <w:rPr>
+                <w:rFonts w:ascii="Arial" w:hAnsi="Arial" w:eastAsia="Arial" w:cs="Arial"/>
+                <w:i w:val="false"/>
+                <w:b w:val="false"/>
+                <w:u w:val="none"/>
+                <w:strike w:val="false"/>
+                <w:sz w:val="22"/>
+                <w:szCs w:val="22"/>
+                <w:color w:val="000000"/>
+              </w:rPr>
+            </w:pPr>
+            <w:r>
+              <w:rPr>
+                <w:rFonts w:ascii="Arial" w:hAnsi="Arial" w:eastAsia="Arial" w:cs="Arial"/>
+                <w:i w:val="false"/>
+                <w:b w:val="false"/>
+                <w:u w:val="none"/>
+                <w:strike w:val="false"/>
+                <w:sz w:val="22"/>
+                <w:szCs w:val="22"/>
+                <w:color w:val="000000"/>
+              </w:rPr>
+              <w:t xml:space="preserve">0.471</w:t>
+            </w:r>
+          </w:p>
+        </w:tc>
+        <w:tc>
+          <w:tcPr>
+            <w:tcBorders>
+              <w:bottom w:val="none" w:sz="0" w:space="0" w:color="000000"/>
+              <w:top w:val="none" w:sz="0" w:space="0" w:color="000000"/>
+              <w:left w:val="none" w:sz="0" w:space="0" w:color="000000"/>
+              <w:right w:val="none" w:sz="0" w:space="0" w:color="000000"/>
+            </w:tcBorders>
+            <w:shd w:val="clear" w:color="auto" w:fill="FFFFFF"/>
+            <w:tcMar>
+              <w:top w:w="0" w:type="dxa"/>
+              <w:bottom w:w="0" w:type="dxa"/>
+              <w:left w:w="0" w:type="dxa"/>
+              <w:right w:w="0" w:type="dxa"/>
+            </w:tcMar>
+            <w:vAlign w:val="center"/>
+          </w:tcPr>
+          <w:p>
+            <w:pPr>
+              <w:pStyle w:val="Normal"/>
+              <w:jc w:val="right"/>
+              <w:pBdr>
+                <w:bottom w:val="none" w:sz="0" w:space="0" w:color="000000"/>
+                <w:top w:val="none" w:sz="0" w:space="0" w:color="000000"/>
+                <w:left w:val="none" w:sz="0" w:space="0" w:color="000000"/>
+                <w:right w:val="none" w:sz="0" w:space="0" w:color="000000"/>
+              </w:pBdr>
+              <w:spacing w:after="100" w:before="100" w:line="240"/>
+              <w:ind w:left="100" w:right="100" w:firstLine="0" w:firstLineChars="0"/>
+              <w:rPr>
+                <w:rFonts w:ascii="Arial" w:hAnsi="Arial" w:eastAsia="Arial" w:cs="Arial"/>
+                <w:i w:val="false"/>
+                <w:b w:val="false"/>
+                <w:u w:val="none"/>
+                <w:strike w:val="false"/>
+                <w:sz w:val="22"/>
+                <w:szCs w:val="22"/>
+                <w:color w:val="000000"/>
+              </w:rPr>
+            </w:pPr>
+            <w:r>
+              <w:rPr>
+                <w:rFonts w:ascii="Arial" w:hAnsi="Arial" w:eastAsia="Arial" w:cs="Arial"/>
+                <w:i w:val="false"/>
+                <w:b w:val="false"/>
+                <w:u w:val="none"/>
+                <w:strike w:val="false"/>
+                <w:sz w:val="22"/>
+                <w:szCs w:val="22"/>
+                <w:color w:val="000000"/>
+              </w:rPr>
+              <w:t xml:space="preserve">0.246</w:t>
+            </w:r>
+          </w:p>
+        </w:tc>
+        <w:tc>
+          <w:tcPr>
+            <w:tcBorders>
+              <w:bottom w:val="none" w:sz="0" w:space="0" w:color="000000"/>
+              <w:top w:val="none" w:sz="0" w:space="0" w:color="000000"/>
+              <w:left w:val="none" w:sz="0" w:space="0" w:color="000000"/>
+              <w:right w:val="none" w:sz="0" w:space="0" w:color="000000"/>
+            </w:tcBorders>
+            <w:shd w:val="clear" w:color="auto" w:fill="FFFFFF"/>
+            <w:tcMar>
+              <w:top w:w="0" w:type="dxa"/>
+              <w:bottom w:w="0" w:type="dxa"/>
+              <w:left w:w="0" w:type="dxa"/>
+              <w:right w:w="0" w:type="dxa"/>
+            </w:tcMar>
+            <w:vAlign w:val="center"/>
+          </w:tcPr>
+          <w:p>
+            <w:pPr>
+              <w:pStyle w:val="Normal"/>
+              <w:jc w:val="left"/>
+              <w:pBdr>
+                <w:bottom w:val="none" w:sz="0" w:space="0" w:color="000000"/>
+                <w:top w:val="none" w:sz="0" w:space="0" w:color="000000"/>
+                <w:left w:val="none" w:sz="0" w:space="0" w:color="000000"/>
+                <w:right w:val="none" w:sz="0" w:space="0" w:color="000000"/>
+              </w:pBdr>
+              <w:spacing w:after="100" w:before="100" w:line="240"/>
+              <w:ind w:left="100" w:right="100" w:firstLine="0" w:firstLineChars="0"/>
+              <w:rPr>
+                <w:rFonts w:ascii="Arial" w:hAnsi="Arial" w:eastAsia="Arial" w:cs="Arial"/>
+                <w:i w:val="false"/>
+                <w:b w:val="false"/>
+                <w:u w:val="none"/>
+                <w:strike w:val="false"/>
+                <w:sz w:val="22"/>
+                <w:szCs w:val="22"/>
+                <w:color w:val="000000"/>
+              </w:rPr>
+            </w:pPr>
+            <w:r>
+              <w:rPr>
+                <w:rFonts w:ascii="Arial" w:hAnsi="Arial" w:eastAsia="Arial" w:cs="Arial"/>
+                <w:i w:val="false"/>
+                <w:b w:val="false"/>
+                <w:u w:val="none"/>
+                <w:strike w:val="false"/>
+                <w:sz w:val="22"/>
+                <w:szCs w:val="22"/>
+                <w:color w:val="000000"/>
+              </w:rPr>
               <w:t xml:space="preserve">Sí</w:t>
             </w:r>
           </w:p>
@@ -24694,7 +24859,7 @@
                 <w:szCs w:val="22"/>
                 <w:color w:val="000000"/>
               </w:rPr>
-              <w:t xml:space="preserve">0.872</w:t>
+              <w:t xml:space="preserve">9.040</w:t>
             </w:r>
           </w:p>
         </w:tc>
@@ -24749,62 +24914,7 @@
                 <w:szCs w:val="22"/>
                 <w:color w:val="000000"/>
               </w:rPr>
-              <w:t xml:space="preserve">0.029</w:t>
-            </w:r>
-          </w:p>
-        </w:tc>
-        <w:tc>
-          <w:tcPr>
-            <w:tcBorders>
-              <w:bottom w:val="none" w:sz="0" w:space="0" w:color="000000"/>
-              <w:top w:val="none" w:sz="0" w:space="0" w:color="000000"/>
-              <w:left w:val="none" w:sz="0" w:space="0" w:color="000000"/>
-              <w:right w:val="none" w:sz="0" w:space="0" w:color="000000"/>
-            </w:tcBorders>
-            <w:shd w:val="clear" w:color="auto" w:fill="FFFFFF"/>
-            <w:tcMar>
-              <w:top w:w="0" w:type="dxa"/>
-              <w:bottom w:w="0" w:type="dxa"/>
-              <w:left w:w="0" w:type="dxa"/>
-              <w:right w:w="0" w:type="dxa"/>
-            </w:tcMar>
-            <w:vAlign w:val="center"/>
-          </w:tcPr>
-          <w:p>
-            <w:pPr>
-              <w:pStyle w:val="Normal"/>
-              <w:jc w:val="left"/>
-              <w:pBdr>
-                <w:bottom w:val="none" w:sz="0" w:space="0" w:color="000000"/>
-                <w:top w:val="none" w:sz="0" w:space="0" w:color="000000"/>
-                <w:left w:val="none" w:sz="0" w:space="0" w:color="000000"/>
-                <w:right w:val="none" w:sz="0" w:space="0" w:color="000000"/>
-              </w:pBdr>
-              <w:spacing w:after="100" w:before="100" w:line="240"/>
-              <w:ind w:left="100" w:right="100" w:firstLine="0" w:firstLineChars="0"/>
-              <w:rPr>
-                <w:rFonts w:ascii="Arial" w:hAnsi="Arial" w:eastAsia="Arial" w:cs="Arial"/>
-                <w:i w:val="false"/>
-                <w:b w:val="false"/>
-                <w:u w:val="none"/>
-                <w:strike w:val="false"/>
-                <w:sz w:val="22"/>
-                <w:szCs w:val="22"/>
-                <w:color w:val="000000"/>
-              </w:rPr>
-            </w:pPr>
-            <w:r>
-              <w:rPr>
-                <w:rFonts w:ascii="Arial" w:hAnsi="Arial" w:eastAsia="Arial" w:cs="Arial"/>
-                <w:i w:val="false"/>
-                <w:b w:val="false"/>
-                <w:u w:val="none"/>
-                <w:strike w:val="false"/>
-                <w:sz w:val="22"/>
-                <w:szCs w:val="22"/>
-                <w:color w:val="000000"/>
-              </w:rPr>
-              <w:t xml:space="preserve">Sí</w:t>
+              <w:t xml:space="preserve">0.738</w:t>
             </w:r>
           </w:p>
         </w:tc>
@@ -24859,7 +24969,7 @@
                 <w:szCs w:val="22"/>
                 <w:color w:val="000000"/>
               </w:rPr>
-              <w:t xml:space="preserve">3.459</w:t>
+              <w:t xml:space="preserve">5,916</w:t>
             </w:r>
           </w:p>
         </w:tc>
@@ -24914,117 +25024,7 @@
                 <w:szCs w:val="22"/>
                 <w:color w:val="000000"/>
               </w:rPr>
-              <w:t xml:space="preserve">0.732</w:t>
-            </w:r>
-          </w:p>
-        </w:tc>
-        <w:tc>
-          <w:tcPr>
-            <w:tcBorders>
-              <w:bottom w:val="none" w:sz="0" w:space="0" w:color="000000"/>
-              <w:top w:val="none" w:sz="0" w:space="0" w:color="000000"/>
-              <w:left w:val="none" w:sz="0" w:space="0" w:color="000000"/>
-              <w:right w:val="none" w:sz="0" w:space="0" w:color="000000"/>
-            </w:tcBorders>
-            <w:shd w:val="clear" w:color="auto" w:fill="FFFFFF"/>
-            <w:tcMar>
-              <w:top w:w="0" w:type="dxa"/>
-              <w:bottom w:w="0" w:type="dxa"/>
-              <w:left w:w="0" w:type="dxa"/>
-              <w:right w:w="0" w:type="dxa"/>
-            </w:tcMar>
-            <w:vAlign w:val="center"/>
-          </w:tcPr>
-          <w:p>
-            <w:pPr>
-              <w:pStyle w:val="Normal"/>
-              <w:jc w:val="right"/>
-              <w:pBdr>
-                <w:bottom w:val="none" w:sz="0" w:space="0" w:color="000000"/>
-                <w:top w:val="none" w:sz="0" w:space="0" w:color="000000"/>
-                <w:left w:val="none" w:sz="0" w:space="0" w:color="000000"/>
-                <w:right w:val="none" w:sz="0" w:space="0" w:color="000000"/>
-              </w:pBdr>
-              <w:spacing w:after="100" w:before="100" w:line="240"/>
-              <w:ind w:left="100" w:right="100" w:firstLine="0" w:firstLineChars="0"/>
-              <w:rPr>
-                <w:rFonts w:ascii="Arial" w:hAnsi="Arial" w:eastAsia="Arial" w:cs="Arial"/>
-                <w:i w:val="false"/>
-                <w:b w:val="false"/>
-                <w:u w:val="none"/>
-                <w:strike w:val="false"/>
-                <w:sz w:val="22"/>
-                <w:szCs w:val="22"/>
-                <w:color w:val="000000"/>
-              </w:rPr>
-            </w:pPr>
-            <w:r>
-              <w:rPr>
-                <w:rFonts w:ascii="Arial" w:hAnsi="Arial" w:eastAsia="Arial" w:cs="Arial"/>
-                <w:i w:val="false"/>
-                <w:b w:val="false"/>
-                <w:u w:val="none"/>
-                <w:strike w:val="false"/>
-                <w:sz w:val="22"/>
-                <w:szCs w:val="22"/>
-                <w:color w:val="000000"/>
-              </w:rPr>
-              <w:t xml:space="preserve">5,417</w:t>
-            </w:r>
-          </w:p>
-        </w:tc>
-        <w:tc>
-          <w:tcPr>
-            <w:tcBorders>
-              <w:bottom w:val="none" w:sz="0" w:space="0" w:color="000000"/>
-              <w:top w:val="none" w:sz="0" w:space="0" w:color="000000"/>
-              <w:left w:val="none" w:sz="0" w:space="0" w:color="000000"/>
-              <w:right w:val="none" w:sz="0" w:space="0" w:color="000000"/>
-            </w:tcBorders>
-            <w:shd w:val="clear" w:color="auto" w:fill="FFFFFF"/>
-            <w:tcMar>
-              <w:top w:w="0" w:type="dxa"/>
-              <w:bottom w:w="0" w:type="dxa"/>
-              <w:left w:w="0" w:type="dxa"/>
-              <w:right w:w="0" w:type="dxa"/>
-            </w:tcMar>
-            <w:vAlign w:val="center"/>
-          </w:tcPr>
-          <w:p>
-            <w:pPr>
-              <w:pStyle w:val="Normal"/>
-              <w:jc w:val="right"/>
-              <w:pBdr>
-                <w:bottom w:val="none" w:sz="0" w:space="0" w:color="000000"/>
-                <w:top w:val="none" w:sz="0" w:space="0" w:color="000000"/>
-                <w:left w:val="none" w:sz="0" w:space="0" w:color="000000"/>
-                <w:right w:val="none" w:sz="0" w:space="0" w:color="000000"/>
-              </w:pBdr>
-              <w:spacing w:after="100" w:before="100" w:line="240"/>
-              <w:ind w:left="100" w:right="100" w:firstLine="0" w:firstLineChars="0"/>
-              <w:rPr>
-                <w:rFonts w:ascii="Arial" w:hAnsi="Arial" w:eastAsia="Arial" w:cs="Arial"/>
-                <w:i w:val="false"/>
-                <w:b w:val="false"/>
-                <w:u w:val="none"/>
-                <w:strike w:val="false"/>
-                <w:sz w:val="22"/>
-                <w:szCs w:val="22"/>
-                <w:color w:val="000000"/>
-              </w:rPr>
-            </w:pPr>
-            <w:r>
-              <w:rPr>
-                <w:rFonts w:ascii="Arial" w:hAnsi="Arial" w:eastAsia="Arial" w:cs="Arial"/>
-                <w:i w:val="false"/>
-                <w:b w:val="false"/>
-                <w:u w:val="none"/>
-                <w:strike w:val="false"/>
-                <w:sz w:val="22"/>
-                <w:szCs w:val="22"/>
-                <w:color w:val="000000"/>
-              </w:rPr>
-              <w:t xml:space="preserve">0.252</w:t>
+              <w:t xml:space="preserve">0.052</w:t>
             </w:r>
           </w:p>
         </w:tc>
@@ -25084,7 +25084,7 @@
                 <w:szCs w:val="22"/>
                 <w:color w:val="000000"/>
               </w:rPr>
-              <w:t xml:space="preserve">Golpe C</w:t>
+              <w:t xml:space="preserve">Proporción de obreros</w:t>
             </w:r>
           </w:p>
         </w:tc>
@@ -25194,7 +25194,7 @@
                 <w:szCs w:val="22"/>
                 <w:color w:val="000000"/>
               </w:rPr>
-              <w:t xml:space="preserve">0.758</w:t>
+              <w:t xml:space="preserve">0.425</w:t>
             </w:r>
           </w:p>
         </w:tc>
@@ -25249,7 +25249,7 @@
                 <w:szCs w:val="22"/>
                 <w:color w:val="000000"/>
               </w:rPr>
-              <w:t xml:space="preserve">0.096</w:t>
+              <w:t xml:space="preserve">0.354</w:t>
             </w:r>
           </w:p>
         </w:tc>
@@ -25304,7 +25304,7 @@
                 <w:szCs w:val="22"/>
                 <w:color w:val="000000"/>
               </w:rPr>
-              <w:t xml:space="preserve">Sí</w:t>
+              <w:t xml:space="preserve">No</w:t>
             </w:r>
           </w:p>
         </w:tc>
@@ -25359,7 +25359,7 @@
                 <w:szCs w:val="22"/>
                 <w:color w:val="000000"/>
               </w:rPr>
-              <w:t xml:space="preserve">3.564</w:t>
+              <w:t xml:space="preserve">0.170</w:t>
             </w:r>
           </w:p>
         </w:tc>
@@ -25414,7 +25414,7 @@
                 <w:szCs w:val="22"/>
                 <w:color w:val="000000"/>
               </w:rPr>
-              <w:t xml:space="preserve">0.723</w:t>
+              <w:t xml:space="preserve">0.760</w:t>
             </w:r>
           </w:p>
         </w:tc>
@@ -25469,7 +25469,7 @@
                 <w:szCs w:val="22"/>
                 <w:color w:val="000000"/>
               </w:rPr>
-              <w:t xml:space="preserve">5,439</w:t>
+              <w:t xml:space="preserve">5,912</w:t>
             </w:r>
           </w:p>
         </w:tc>
@@ -25524,7 +25524,7 @@
                 <w:szCs w:val="22"/>
                 <w:color w:val="000000"/>
               </w:rPr>
-              <w:t xml:space="preserve">0.213</w:t>
+              <w:t xml:space="preserve">2.501</w:t>
             </w:r>
           </w:p>
         </w:tc>
@@ -25584,7 +25584,7 @@
                 <w:szCs w:val="22"/>
                 <w:color w:val="000000"/>
               </w:rPr>
-              <w:t xml:space="preserve">Exposure</w:t>
+              <w:t xml:space="preserve">Golpe C</w:t>
             </w:r>
           </w:p>
         </w:tc>
@@ -25694,7 +25694,7 @@
                 <w:szCs w:val="22"/>
                 <w:color w:val="000000"/>
               </w:rPr>
-              <w:t xml:space="preserve">0.457</w:t>
+              <w:t xml:space="preserve">0.382</w:t>
             </w:r>
           </w:p>
         </w:tc>
@@ -25749,7 +25749,7 @@
                 <w:szCs w:val="22"/>
                 <w:color w:val="000000"/>
               </w:rPr>
-              <w:t xml:space="preserve">0.324</w:t>
+              <w:t xml:space="preserve">0.334</w:t>
             </w:r>
           </w:p>
         </w:tc>
@@ -25804,7 +25804,7 @@
                 <w:szCs w:val="22"/>
                 <w:color w:val="000000"/>
               </w:rPr>
-              <w:t xml:space="preserve">No</w:t>
+              <w:t xml:space="preserve">Sí</w:t>
             </w:r>
           </w:p>
         </w:tc>
@@ -25859,7 +25859,7 @@
                 <w:szCs w:val="22"/>
                 <w:color w:val="000000"/>
               </w:rPr>
-              <w:t xml:space="preserve">0.193</w:t>
+              <w:t xml:space="preserve">3.094</w:t>
             </w:r>
           </w:p>
         </w:tc>
@@ -25914,7 +25914,7 @@
                 <w:szCs w:val="22"/>
                 <w:color w:val="000000"/>
               </w:rPr>
-              <w:t xml:space="preserve">0.760</w:t>
+              <w:t xml:space="preserve">0.718</w:t>
             </w:r>
           </w:p>
         </w:tc>
@@ -25969,7 +25969,7 @@
                 <w:szCs w:val="22"/>
                 <w:color w:val="000000"/>
               </w:rPr>
-              <w:t xml:space="preserve">5,912</w:t>
+              <w:t xml:space="preserve">5,468</w:t>
             </w:r>
           </w:p>
         </w:tc>
@@ -26024,7 +26024,7 @@
                 <w:szCs w:val="22"/>
                 <w:color w:val="000000"/>
               </w:rPr>
-              <w:t xml:space="preserve">2.365</w:t>
+              <w:t xml:space="preserve">0.124</w:t>
             </w:r>
           </w:p>
         </w:tc>

</xml_diff>